<commit_message>
Add inline symptom input, bounded safeguards, system policy and reconciled TODO
</commit_message>
<xml_diff>
--- a/04_To_Build_Evaluation_Decisions.docx
+++ b/04_To_Build_Evaluation_Decisions.docx
@@ -7,7 +7,10 @@
         <w:pStyle w:val="Title"/>
       </w:pPr>
       <w:r>
-        <w:t>04  |  To build &amp; evidence plan</w:t>
+        <w:rPr>
+          <w:color w:val="000000"/>
+        </w:rPr>
+        <w:t>MotoMedic AI build and evaluation decisions</w:t>
       </w:r>
     </w:p>
     <w:p>
@@ -15,6 +18,9 @@
         <w:pStyle w:val="Subtitle"/>
       </w:pPr>
       <w:r>
+        <w:rPr>
+          <w:color w:val="000000"/>
+        </w:rPr>
         <w:t>Execution inventory, design decisions, scenarios, golden-case framework and release checklist</w:t>
       </w:r>
     </w:p>
@@ -25,7 +31,13 @@
           <w:color w:val="B5631D"/>
           <w:sz w:val="17"/>
         </w:rPr>
-        <w:t>DRAFT  v0.2    •    Owner-manual prototype; independent review and variant fit pending</w:t>
+        <w:t>v0.3  Refreshed 9 October 2026  Aligned to TRD v0.4</w:t>
+      </w:r>
+    </w:p>
+    <w:p>
+      <w:pPr/>
+      <w:r>
+        <w:t>TRD v0.4 is the authoritative design and technical contract as of 9 October 2026. This document follows it. The approved owner manual governs motorcycle facts; source applicability, rights, independent review and release gates remain mandatory. Recorded implementation progress does not constitute release approval.</w:t>
       </w:r>
     </w:p>
     <w:p>
@@ -33,12 +45,15 @@
         <w:pStyle w:val="Heading1"/>
       </w:pPr>
       <w:r>
+        <w:rPr>
+          <w:color w:val="000000"/>
+        </w:rPr>
         <w:t>1  Documentation and build register</w:t>
       </w:r>
     </w:p>
     <w:p>
       <w:r>
-        <w:t>This is the consolidated tracker for everything not separately delivered as the concept architecture, PRD and TRD. It identifies immediate drafting/build tasks, dependencies on the OEM manual, experiment options and the final interview handover package.</w:t>
+        <w:t>This register is the design note and TODO inventory for the concept, PRD and authoritative TRD v0.4. It records adopted choices, measured candidate results, alternatives and pending work. Completion of ingestion or a backend smoke test does not establish source sufficiency, controller integration or public-demo readiness.</w:t>
       </w:r>
     </w:p>
     <w:tbl>
@@ -64,6 +79,9 @@
             <w:shd w:fill="102238"/>
           </w:tcPr>
           <w:p>
+            <w:pPr>
+              <w:keepNext/>
+            </w:pPr>
             <w:r>
               <w:rPr>
                 <w:b/>
@@ -117,9 +135,6 @@
             <w:vAlign w:val="center"/>
           </w:tcPr>
           <w:p>
-            <w:pPr>
-              <w:spacing w:after="20"/>
-            </w:pPr>
             <w:r>
               <w:rPr>
                 <w:sz w:val="16"/>
@@ -134,14 +149,8 @@
             <w:vAlign w:val="center"/>
           </w:tcPr>
           <w:p>
-            <w:pPr>
-              <w:spacing w:after="20"/>
-            </w:pPr>
-            <w:r>
-              <w:rPr>
-                <w:sz w:val="16"/>
-              </w:rPr>
-              <w:t>DRAFT COMPLETE</w:t>
+            <w:r>
+              <w:t>REFRESHED v0.3; dated reconciliation added</w:t>
             </w:r>
           </w:p>
         </w:tc>
@@ -151,14 +160,8 @@
             <w:vAlign w:val="center"/>
           </w:tcPr>
           <w:p>
-            <w:pPr>
-              <w:spacing w:after="20"/>
-            </w:pPr>
-            <w:r>
-              <w:rPr>
-                <w:sz w:val="16"/>
-              </w:rPr>
-              <w:t>Review against actual manual</w:t>
+            <w:r>
+              <w:t>TRD v0.4 governs; exact 161 initial/source scopes approved; remaining release gates tracked</w:t>
             </w:r>
           </w:p>
         </w:tc>
@@ -174,9 +177,6 @@
             <w:shd w:fill="F3F6FA"/>
           </w:tcPr>
           <w:p>
-            <w:pPr>
-              <w:spacing w:after="20"/>
-            </w:pPr>
             <w:r>
               <w:rPr>
                 <w:sz w:val="16"/>
@@ -192,14 +192,11 @@
             <w:shd w:fill="F3F6FA"/>
           </w:tcPr>
           <w:p>
-            <w:pPr>
-              <w:spacing w:after="20"/>
-            </w:pPr>
             <w:r>
               <w:rPr>
                 <w:sz w:val="16"/>
               </w:rPr>
-              <w:t>DRAFT COMPLETE</w:t>
+              <w:t>REFRESHED v0.3</w:t>
             </w:r>
           </w:p>
         </w:tc>
@@ -210,14 +207,11 @@
             <w:shd w:fill="F3F6FA"/>
           </w:tcPr>
           <w:p>
-            <w:pPr>
-              <w:spacing w:after="20"/>
-            </w:pPr>
             <w:r>
               <w:rPr>
                 <w:sz w:val="16"/>
               </w:rPr>
-              <w:t>Agree P0 vs P1 once manual is assessed</w:t>
+              <w:t>Reviewed-rule, evidence, cache and route gates specified</w:t>
             </w:r>
           </w:p>
         </w:tc>
@@ -232,9 +226,6 @@
             <w:vAlign w:val="center"/>
           </w:tcPr>
           <w:p>
-            <w:pPr>
-              <w:spacing w:after="20"/>
-            </w:pPr>
             <w:r>
               <w:rPr>
                 <w:sz w:val="16"/>
@@ -249,14 +240,11 @@
             <w:vAlign w:val="center"/>
           </w:tcPr>
           <w:p>
-            <w:pPr>
-              <w:spacing w:after="20"/>
-            </w:pPr>
             <w:r>
               <w:rPr>
                 <w:sz w:val="16"/>
               </w:rPr>
-              <w:t>DRAFT COMPLETE</w:t>
+              <w:t>AUTHORITATIVE v0.4</w:t>
             </w:r>
           </w:p>
         </w:tc>
@@ -266,14 +254,11 @@
             <w:vAlign w:val="center"/>
           </w:tcPr>
           <w:p>
-            <w:pPr>
-              <w:spacing w:after="20"/>
-            </w:pPr>
             <w:r>
               <w:rPr>
                 <w:sz w:val="16"/>
               </w:rPr>
-              <w:t>Validate parsing and model/provider choices</w:t>
+              <w:t>Implementation must satisfy registry/controller and release contracts</w:t>
             </w:r>
           </w:p>
         </w:tc>
@@ -365,7 +350,7 @@
           </w:tcPr>
           <w:p>
             <w:r>
-              <w:t>DRAFT: 37 atomic cases; human review pending</w:t>
+              <w:t>161 exact initial/source scopes approved</w:t>
             </w:r>
           </w:p>
         </w:tc>
@@ -375,14 +360,8 @@
             <w:vAlign w:val="center"/>
           </w:tcPr>
           <w:p>
-            <w:pPr>
-              <w:spacing w:after="20"/>
-            </w:pPr>
-            <w:r>
-              <w:rPr>
-                <w:sz w:val="16"/>
-              </w:rPr>
-              <w:t>Verified exact citations and expected outcomes</w:t>
+            <w:r>
+              <w:t>V3 coordinator approval is content/version bound; adaptive and held-out release evaluation remains open</w:t>
             </w:r>
           </w:p>
         </w:tc>
@@ -398,9 +377,6 @@
             <w:shd w:fill="F3F6FA"/>
           </w:tcPr>
           <w:p>
-            <w:pPr>
-              <w:spacing w:after="20"/>
-            </w:pPr>
             <w:r>
               <w:rPr>
                 <w:sz w:val="16"/>
@@ -416,14 +392,8 @@
             <w:shd w:fill="F3F6FA"/>
           </w:tcPr>
           <w:p>
-            <w:pPr>
-              <w:spacing w:after="20"/>
-            </w:pPr>
-            <w:r>
-              <w:rPr>
-                <w:sz w:val="16"/>
-              </w:rPr>
-              <w:t>DRAFT; HARDEN</w:t>
+            <w:r>
+              <w:t>INTEGRATED bounded text gates; serving release pending</w:t>
             </w:r>
           </w:p>
         </w:tc>
@@ -434,14 +404,8 @@
             <w:shd w:fill="F3F6FA"/>
           </w:tcPr>
           <w:p>
-            <w:pPr>
-              <w:spacing w:after="20"/>
-            </w:pPr>
-            <w:r>
-              <w:rPr>
-                <w:sz w:val="16"/>
-              </w:rPr>
-              <w:t>Validate against manual warnings/rights</w:t>
+            <w:r>
+              <w:t>Retain five routes, warning/dependency/claim gates, typed outcomes and verified OEM route</w:t>
             </w:r>
           </w:p>
         </w:tc>
@@ -456,9 +420,6 @@
             <w:vAlign w:val="center"/>
           </w:tcPr>
           <w:p>
-            <w:pPr>
-              <w:spacing w:after="20"/>
-            </w:pPr>
             <w:r>
               <w:rPr>
                 <w:sz w:val="16"/>
@@ -473,14 +434,11 @@
             <w:vAlign w:val="center"/>
           </w:tcPr>
           <w:p>
-            <w:pPr>
-              <w:spacing w:after="20"/>
-            </w:pPr>
             <w:r>
               <w:rPr>
                 <w:sz w:val="16"/>
               </w:rPr>
-              <w:t>SEE SECTION 3</w:t>
+              <w:t>UPDATED section 3 and change record</w:t>
             </w:r>
           </w:p>
         </w:tc>
@@ -490,14 +448,11 @@
             <w:vAlign w:val="center"/>
           </w:tcPr>
           <w:p>
-            <w:pPr>
-              <w:spacing w:after="20"/>
-            </w:pPr>
             <w:r>
               <w:rPr>
                 <w:sz w:val="16"/>
               </w:rPr>
-              <w:t>Benchmark assumptions and update ADRs</w:t>
+              <w:t>Held-out reviewed evidence required for reversal</w:t>
             </w:r>
           </w:p>
         </w:tc>
@@ -531,14 +486,8 @@
             <w:shd w:fill="F3F6FA"/>
           </w:tcPr>
           <w:p>
-            <w:pPr>
-              <w:spacing w:after="20"/>
-            </w:pPr>
-            <w:r>
-              <w:rPr>
-                <w:sz w:val="16"/>
-              </w:rPr>
-              <w:t>SEE SECTION 4</w:t>
+            <w:r>
+              <w:t>SECTIONS 5 AND 6; runtime pending</w:t>
             </w:r>
           </w:p>
         </w:tc>
@@ -571,9 +520,6 @@
             <w:vAlign w:val="center"/>
           </w:tcPr>
           <w:p>
-            <w:pPr>
-              <w:spacing w:after="20"/>
-            </w:pPr>
             <w:r>
               <w:rPr>
                 <w:sz w:val="16"/>
@@ -588,14 +534,11 @@
             <w:vAlign w:val="center"/>
           </w:tcPr>
           <w:p>
-            <w:pPr>
-              <w:spacing w:after="20"/>
-            </w:pPr>
             <w:r>
               <w:rPr>
                 <w:sz w:val="16"/>
               </w:rPr>
-              <w:t>TO BUILD</w:t>
+              <w:t>HOSTED candidate QA complete; review open</w:t>
             </w:r>
           </w:p>
         </w:tc>
@@ -605,14 +548,11 @@
             <w:vAlign w:val="center"/>
           </w:tcPr>
           <w:p>
-            <w:pPr>
-              <w:spacing w:after="20"/>
-            </w:pPr>
             <w:r>
               <w:rPr>
                 <w:sz w:val="16"/>
               </w:rPr>
-              <w:t>Coverage review of tables, figures, warnings</w:t>
+              <w:t>149 represented pages; page 103 fallback flagged; warning/procedure associations pending</w:t>
             </w:r>
           </w:p>
         </w:tc>
@@ -628,9 +568,6 @@
             <w:shd w:fill="F3F6FA"/>
           </w:tcPr>
           <w:p>
-            <w:pPr>
-              <w:spacing w:after="20"/>
-            </w:pPr>
             <w:r>
               <w:rPr>
                 <w:sz w:val="16"/>
@@ -646,14 +583,11 @@
             <w:shd w:fill="F3F6FA"/>
           </w:tcPr>
           <w:p>
-            <w:pPr>
-              <w:spacing w:after="20"/>
-            </w:pPr>
             <w:r>
               <w:rPr>
                 <w:sz w:val="16"/>
               </w:rPr>
-              <w:t>TO BUILD</w:t>
+              <w:t>DRAFT in-sample diagnostics complete</w:t>
             </w:r>
           </w:p>
         </w:tc>
@@ -664,14 +598,11 @@
             <w:shd w:fill="F3F6FA"/>
           </w:tcPr>
           <w:p>
-            <w:pPr>
-              <w:spacing w:after="20"/>
-            </w:pPr>
             <w:r>
               <w:rPr>
                 <w:sz w:val="16"/>
               </w:rPr>
-              <w:t>Reproducible comparison on same gold set</w:t>
+              <w:t>Independent &gt;=25-case review, calibration and holdout pending</w:t>
             </w:r>
           </w:p>
         </w:tc>
@@ -703,14 +634,8 @@
             <w:vAlign w:val="center"/>
           </w:tcPr>
           <w:p>
-            <w:pPr>
-              <w:spacing w:after="20"/>
-            </w:pPr>
-            <w:r>
-              <w:rPr>
-                <w:sz w:val="16"/>
-              </w:rPr>
-              <w:t>TO BUILD</w:t>
+            <w:r>
+              <w:t>29 UI/boundary tests pass; hosted enforcement open</w:t>
             </w:r>
           </w:p>
         </w:tc>
@@ -720,14 +645,8 @@
             <w:vAlign w:val="center"/>
           </w:tcPr>
           <w:p>
-            <w:pPr>
-              <w:spacing w:after="20"/>
-            </w:pPr>
-            <w:r>
-              <w:rPr>
-                <w:sz w:val="16"/>
-              </w:rPr>
-              <w:t>Prompt injection, media handling, credentials</w:t>
+            <w:r>
+              <w:t>Text/photo/context/quota/prompt binding checks; test actual identity, concurrency and retention in hosted service</w:t>
             </w:r>
           </w:p>
         </w:tc>
@@ -743,9 +662,6 @@
             <w:shd w:fill="F3F6FA"/>
           </w:tcPr>
           <w:p>
-            <w:pPr>
-              <w:spacing w:after="20"/>
-            </w:pPr>
             <w:r>
               <w:rPr>
                 <w:sz w:val="16"/>
@@ -761,14 +677,8 @@
             <w:shd w:fill="F3F6FA"/>
           </w:tcPr>
           <w:p>
-            <w:pPr>
-              <w:spacing w:after="20"/>
-            </w:pPr>
-            <w:r>
-              <w:rPr>
-                <w:sz w:val="16"/>
-              </w:rPr>
-              <w:t>TO BUILD</w:t>
+            <w:r>
+              <w:t>UI implemented; hosted rider API and deployment pending</w:t>
             </w:r>
           </w:p>
         </w:tc>
@@ -779,14 +689,8 @@
             <w:shd w:fill="F3F6FA"/>
           </w:tcPr>
           <w:p>
-            <w:pPr>
-              <w:spacing w:after="20"/>
-            </w:pPr>
-            <w:r>
-              <w:rPr>
-                <w:sz w:val="16"/>
-              </w:rPr>
-              <w:t>Live URL plus smoke test</w:t>
+            <w:r>
+              <w:t>Real browser-to-retrieval-to-gated-answer acceptance required; retrieval service alone is not rider API</w:t>
             </w:r>
           </w:p>
         </w:tc>
@@ -801,9 +705,6 @@
             <w:vAlign w:val="center"/>
           </w:tcPr>
           <w:p>
-            <w:pPr>
-              <w:spacing w:after="20"/>
-            </w:pPr>
             <w:r>
               <w:rPr>
                 <w:sz w:val="16"/>
@@ -818,14 +719,11 @@
             <w:vAlign w:val="center"/>
           </w:tcPr>
           <w:p>
-            <w:pPr>
-              <w:spacing w:after="20"/>
-            </w:pPr>
             <w:r>
               <w:rPr>
                 <w:sz w:val="16"/>
               </w:rPr>
-              <w:t>TO BUILD</w:t>
+              <w:t>README exists; handover pending</w:t>
             </w:r>
           </w:p>
         </w:tc>
@@ -835,14 +733,11 @@
             <w:vAlign w:val="center"/>
           </w:tcPr>
           <w:p>
-            <w:pPr>
-              <w:spacing w:after="20"/>
-            </w:pPr>
             <w:r>
               <w:rPr>
                 <w:sz w:val="16"/>
               </w:rPr>
-              <w:t>Independent handover reproducible</w:t>
+              <w:t>Complete rider demo script, operations and rollback after release</w:t>
             </w:r>
           </w:p>
         </w:tc>
@@ -877,7 +772,7 @@
           </w:tcPr>
           <w:p>
             <w:r>
-              <w:t>DRAFT: verify variant and rights</w:t>
+              <w:t>Exact approved Himalayan BS6 scope; citation metadata only</w:t>
             </w:r>
           </w:p>
         </w:tc>
@@ -888,26 +783,33 @@
             <w:shd w:fill="F3F6FA"/>
           </w:tcPr>
           <w:p>
-            <w:pPr>
-              <w:spacing w:after="20"/>
-            </w:pPr>
+            <w:r>
+              <w:t>No rider PDF/excerpt/crop delivery; preserve exact source release scopes</w:t>
+            </w:r>
+          </w:p>
+        </w:tc>
+      </w:tr>
+      <w:tr>
+        <w:tc>
+          <w:tcPr>
+            <w:tcW w:type="dxa" w:w="3341"/>
+          </w:tcPr>
+          <w:p>
             <w:r>
               <w:rPr>
                 <w:sz w:val="16"/>
               </w:rPr>
-              <w:t>Checksum, edition, citation provenance, rights</w:t>
-            </w:r>
-          </w:p>
-        </w:tc>
-      </w:tr>
-      <w:tr>
+              <w:t>Guardrail implementation and safety regression suite</w:t>
+            </w:r>
+          </w:p>
+        </w:tc>
         <w:tc>
           <w:tcPr>
             <w:tcW w:type="dxa" w:w="3341"/>
           </w:tcPr>
           <w:p>
             <w:r>
-              <w:t>Guardrail implementation and safety regression suite</w:t>
+              <w:t>Runtime gates plus tested safeguard components; hosted integration open</w:t>
             </w:r>
           </w:p>
         </w:tc>
@@ -917,17 +819,7 @@
           </w:tcPr>
           <w:p>
             <w:r>
-              <w:t>TO BUILD; design added in section 11</w:t>
-            </w:r>
-          </w:p>
-        </w:tc>
-        <w:tc>
-          <w:tcPr>
-            <w:tcW w:type="dxa" w:w="3341"/>
-          </w:tcPr>
-          <w:p>
-            <w:r>
-              <w:t>All G-01 through G-09 checks pass against reviewed cases, including cache invalidation and error-state tests</w:t>
+              <w:t>Install managed admission, new prompt/context version, retention and actual browser regressions</w:t>
             </w:r>
           </w:p>
         </w:tc>
@@ -943,6 +835,9 @@
         <w:pStyle w:val="Heading1"/>
       </w:pPr>
       <w:r>
+        <w:rPr>
+          <w:color w:val="000000"/>
+        </w:rPr>
         <w:t>2  Scenario backlog (not golden answers)</w:t>
       </w:r>
     </w:p>
@@ -970,6 +865,9 @@
             <w:shd w:fill="102238"/>
           </w:tcPr>
           <w:p>
+            <w:pPr>
+              <w:keepNext/>
+            </w:pPr>
             <w:r>
               <w:rPr>
                 <w:b/>
@@ -1073,14 +971,11 @@
             <w:vAlign w:val="center"/>
           </w:tcPr>
           <w:p>
-            <w:pPr>
-              <w:spacing w:after="20"/>
-            </w:pPr>
             <w:r>
               <w:rPr>
                 <w:sz w:val="16"/>
               </w:rPr>
-              <w:t>ANSWER</w:t>
+              <w:t>SUPPORTED</w:t>
             </w:r>
           </w:p>
         </w:tc>
@@ -1149,14 +1044,11 @@
             <w:shd w:fill="F3F6FA"/>
           </w:tcPr>
           <w:p>
-            <w:pPr>
-              <w:spacing w:after="20"/>
-            </w:pPr>
             <w:r>
               <w:rPr>
                 <w:sz w:val="16"/>
               </w:rPr>
-              <w:t>CLARIFY</w:t>
+              <w:t>AMBIGUOUS</w:t>
             </w:r>
           </w:p>
         </w:tc>
@@ -1223,14 +1115,11 @@
             <w:vAlign w:val="center"/>
           </w:tcPr>
           <w:p>
-            <w:pPr>
-              <w:spacing w:after="20"/>
-            </w:pPr>
             <w:r>
               <w:rPr>
                 <w:sz w:val="16"/>
               </w:rPr>
-              <w:t>NEXT_ELIGIBLE</w:t>
+              <w:t>Re-evaluate eligible next step; gate final status</w:t>
             </w:r>
           </w:p>
         </w:tc>
@@ -1299,14 +1188,11 @@
             <w:shd w:fill="F3F6FA"/>
           </w:tcPr>
           <w:p>
-            <w:pPr>
-              <w:spacing w:after="20"/>
-            </w:pPr>
             <w:r>
               <w:rPr>
                 <w:sz w:val="16"/>
               </w:rPr>
-              <w:t>NEXT_ELIGIBLE</w:t>
+              <w:t>Re-evaluate eligible next step; unresolved is not normal</w:t>
             </w:r>
           </w:p>
         </w:tc>
@@ -1373,14 +1259,11 @@
             <w:vAlign w:val="center"/>
           </w:tcPr>
           <w:p>
-            <w:pPr>
-              <w:spacing w:after="20"/>
-            </w:pPr>
             <w:r>
               <w:rPr>
                 <w:sz w:val="16"/>
               </w:rPr>
-              <w:t>CLARIFY/ABSTAIN</w:t>
+              <w:t>AMBIGUOUS or UNSUPPORTED; block action</w:t>
             </w:r>
           </w:p>
         </w:tc>
@@ -1449,14 +1332,11 @@
             <w:shd w:fill="F3F6FA"/>
           </w:tcPr>
           <w:p>
-            <w:pPr>
-              <w:spacing w:after="20"/>
-            </w:pPr>
             <w:r>
               <w:rPr>
                 <w:sz w:val="16"/>
               </w:rPr>
-              <w:t>ANSWER</w:t>
+              <w:t>SUPPORTED or UNSUPPORTED</w:t>
             </w:r>
           </w:p>
         </w:tc>
@@ -1523,14 +1403,11 @@
             <w:vAlign w:val="center"/>
           </w:tcPr>
           <w:p>
-            <w:pPr>
-              <w:spacing w:after="20"/>
-            </w:pPr>
             <w:r>
               <w:rPr>
                 <w:sz w:val="16"/>
               </w:rPr>
-              <w:t>CLARIFY</w:t>
+              <w:t>AMBIGUOUS</w:t>
             </w:r>
           </w:p>
         </w:tc>
@@ -1599,14 +1476,11 @@
             <w:shd w:fill="F3F6FA"/>
           </w:tcPr>
           <w:p>
-            <w:pPr>
-              <w:spacing w:after="20"/>
-            </w:pPr>
             <w:r>
               <w:rPr>
                 <w:sz w:val="16"/>
               </w:rPr>
-              <w:t>ABSTAIN+OEM</w:t>
+              <w:t>UNSUPPORTED and verified OEM support</w:t>
             </w:r>
           </w:p>
         </w:tc>
@@ -1673,14 +1547,11 @@
             <w:vAlign w:val="center"/>
           </w:tcPr>
           <w:p>
-            <w:pPr>
-              <w:spacing w:after="20"/>
-            </w:pPr>
             <w:r>
               <w:rPr>
                 <w:sz w:val="16"/>
               </w:rPr>
-              <w:t>REPLAN</w:t>
+              <w:t>Supersede fact; re-evaluate; gate final status</w:t>
             </w:r>
           </w:p>
         </w:tc>
@@ -1749,14 +1620,11 @@
             <w:shd w:fill="F3F6FA"/>
           </w:tcPr>
           <w:p>
-            <w:pPr>
-              <w:spacing w:after="20"/>
-            </w:pPr>
             <w:r>
               <w:rPr>
                 <w:sz w:val="16"/>
               </w:rPr>
-              <w:t>REPLAN</w:t>
+              <w:t>Re-evaluate applicability; gate final status</w:t>
             </w:r>
           </w:p>
         </w:tc>
@@ -1823,14 +1691,11 @@
             <w:vAlign w:val="center"/>
           </w:tcPr>
           <w:p>
-            <w:pPr>
-              <w:spacing w:after="20"/>
-            </w:pPr>
             <w:r>
               <w:rPr>
                 <w:sz w:val="16"/>
               </w:rPr>
-              <w:t>MUST NOT REPEAT</w:t>
+              <w:t>Reject unjustified repeat; gate final status</w:t>
             </w:r>
           </w:p>
         </w:tc>
@@ -1899,14 +1764,11 @@
             <w:shd w:fill="F3F6FA"/>
           </w:tcPr>
           <w:p>
-            <w:pPr>
-              <w:spacing w:after="20"/>
-            </w:pPr>
             <w:r>
               <w:rPr>
                 <w:sz w:val="16"/>
               </w:rPr>
-              <w:t>CLARIFY/ABSTAIN</w:t>
+              <w:t>AMBIGUOUS or UNSUPPORTED</w:t>
             </w:r>
           </w:p>
         </w:tc>
@@ -1973,14 +1835,11 @@
             <w:vAlign w:val="center"/>
           </w:tcPr>
           <w:p>
-            <w:pPr>
-              <w:spacing w:after="20"/>
-            </w:pPr>
             <w:r>
               <w:rPr>
                 <w:sz w:val="16"/>
               </w:rPr>
-              <w:t>ANSWER/CLARIFY</w:t>
+              <w:t>SUPPORTED or AMBIGUOUS</w:t>
             </w:r>
           </w:p>
         </w:tc>
@@ -2049,14 +1908,11 @@
             <w:shd w:fill="F3F6FA"/>
           </w:tcPr>
           <w:p>
-            <w:pPr>
-              <w:spacing w:after="20"/>
-            </w:pPr>
             <w:r>
               <w:rPr>
                 <w:sz w:val="16"/>
               </w:rPr>
-              <w:t>CLARIFY</w:t>
+              <w:t>AMBIGUOUS</w:t>
             </w:r>
           </w:p>
         </w:tc>
@@ -2123,14 +1979,11 @@
             <w:vAlign w:val="center"/>
           </w:tcPr>
           <w:p>
-            <w:pPr>
-              <w:spacing w:after="20"/>
-            </w:pPr>
             <w:r>
               <w:rPr>
                 <w:sz w:val="16"/>
               </w:rPr>
-              <w:t>BLOCK/CLARIFY</w:t>
+              <w:t>AMBIGUOUS or UNSUPPORTED; block action</w:t>
             </w:r>
           </w:p>
         </w:tc>
@@ -2199,14 +2052,11 @@
             <w:shd w:fill="F3F6FA"/>
           </w:tcPr>
           <w:p>
-            <w:pPr>
-              <w:spacing w:after="20"/>
-            </w:pPr>
             <w:r>
               <w:rPr>
                 <w:sz w:val="16"/>
               </w:rPr>
-              <w:t>ANSWER</w:t>
+              <w:t>SUPPORTED only with complete approved dependencies</w:t>
             </w:r>
           </w:p>
         </w:tc>
@@ -2273,14 +2123,11 @@
             <w:vAlign w:val="center"/>
           </w:tcPr>
           <w:p>
-            <w:pPr>
-              <w:spacing w:after="20"/>
-            </w:pPr>
             <w:r>
               <w:rPr>
                 <w:sz w:val="16"/>
               </w:rPr>
-              <w:t>ANSWER+WARNING</w:t>
+              <w:t>SUPPORTED with required warning</w:t>
             </w:r>
           </w:p>
         </w:tc>
@@ -2349,14 +2196,11 @@
             <w:shd w:fill="F3F6FA"/>
           </w:tcPr>
           <w:p>
-            <w:pPr>
-              <w:spacing w:after="20"/>
-            </w:pPr>
             <w:r>
               <w:rPr>
                 <w:sz w:val="16"/>
               </w:rPr>
-              <w:t>ANSWER WITH BOTH</w:t>
+              <w:t>SUPPORTED with prerequisite and action</w:t>
             </w:r>
           </w:p>
         </w:tc>
@@ -2423,14 +2267,11 @@
             <w:vAlign w:val="center"/>
           </w:tcPr>
           <w:p>
-            <w:pPr>
-              <w:spacing w:after="20"/>
-            </w:pPr>
             <w:r>
               <w:rPr>
                 <w:sz w:val="16"/>
               </w:rPr>
-              <w:t>ABSTAIN/REVIEW</w:t>
+              <w:t>UNSUPPORTED and source review</w:t>
             </w:r>
           </w:p>
         </w:tc>
@@ -2499,14 +2340,11 @@
             <w:shd w:fill="F3F6FA"/>
           </w:tcPr>
           <w:p>
-            <w:pPr>
-              <w:spacing w:after="20"/>
-            </w:pPr>
             <w:r>
               <w:rPr>
                 <w:sz w:val="16"/>
               </w:rPr>
-              <w:t>CLARIFY/REVIEW</w:t>
+              <w:t>UNSUPPORTED and source review</w:t>
             </w:r>
           </w:p>
         </w:tc>
@@ -2573,14 +2411,11 @@
             <w:vAlign w:val="center"/>
           </w:tcPr>
           <w:p>
-            <w:pPr>
-              <w:spacing w:after="20"/>
-            </w:pPr>
             <w:r>
               <w:rPr>
                 <w:sz w:val="16"/>
               </w:rPr>
-              <w:t>ABSTAIN+OEM</w:t>
+              <w:t>UNSUPPORTED and verified OEM support</w:t>
             </w:r>
           </w:p>
         </w:tc>
@@ -2649,14 +2484,11 @@
             <w:shd w:fill="F3F6FA"/>
           </w:tcPr>
           <w:p>
-            <w:pPr>
-              <w:spacing w:after="20"/>
-            </w:pPr>
             <w:r>
               <w:rPr>
                 <w:sz w:val="16"/>
               </w:rPr>
-              <w:t>ABSTAIN+OEM</w:t>
+              <w:t>UNSUPPORTED and verified OEM support</w:t>
             </w:r>
           </w:p>
         </w:tc>
@@ -2723,14 +2555,11 @@
             <w:vAlign w:val="center"/>
           </w:tcPr>
           <w:p>
-            <w:pPr>
-              <w:spacing w:after="20"/>
-            </w:pPr>
             <w:r>
               <w:rPr>
                 <w:sz w:val="16"/>
               </w:rPr>
-              <w:t>BLOCK</w:t>
+              <w:t>UNSUPPORTED; block mismatch</w:t>
             </w:r>
           </w:p>
         </w:tc>
@@ -2799,9 +2628,6 @@
             <w:shd w:fill="F3F6FA"/>
           </w:tcPr>
           <w:p>
-            <w:pPr>
-              <w:spacing w:after="20"/>
-            </w:pPr>
             <w:r>
               <w:rPr>
                 <w:sz w:val="16"/>
@@ -2873,14 +2699,11 @@
             <w:vAlign w:val="center"/>
           </w:tcPr>
           <w:p>
-            <w:pPr>
-              <w:spacing w:after="20"/>
-            </w:pPr>
             <w:r>
               <w:rPr>
                 <w:sz w:val="16"/>
               </w:rPr>
-              <w:t>CLARIFY/ABSTAIN</w:t>
+              <w:t>UNSUPPORTED and review; known applicable stop wins</w:t>
             </w:r>
           </w:p>
         </w:tc>
@@ -2949,14 +2772,11 @@
             <w:shd w:fill="F3F6FA"/>
           </w:tcPr>
           <w:p>
-            <w:pPr>
-              <w:spacing w:after="20"/>
-            </w:pPr>
             <w:r>
               <w:rPr>
                 <w:sz w:val="16"/>
               </w:rPr>
-              <w:t>IGNORE INJECTION</w:t>
+              <w:t>Ignore injection; ordinary gates determine status</w:t>
             </w:r>
           </w:p>
         </w:tc>
@@ -3023,14 +2843,11 @@
             <w:vAlign w:val="center"/>
           </w:tcPr>
           <w:p>
-            <w:pPr>
-              <w:spacing w:after="20"/>
-            </w:pPr>
             <w:r>
               <w:rPr>
                 <w:sz w:val="16"/>
               </w:rPr>
-              <w:t>IGNORE INJECTION</w:t>
+              <w:t>Ignore injection; ordinary gates determine status</w:t>
             </w:r>
           </w:p>
         </w:tc>
@@ -3099,9 +2916,6 @@
             <w:shd w:fill="F3F6FA"/>
           </w:tcPr>
           <w:p>
-            <w:pPr>
-              <w:spacing w:after="20"/>
-            </w:pPr>
             <w:r>
               <w:rPr>
                 <w:sz w:val="16"/>
@@ -3173,14 +2987,11 @@
             <w:vAlign w:val="center"/>
           </w:tcPr>
           <w:p>
-            <w:pPr>
-              <w:spacing w:after="20"/>
-            </w:pPr>
             <w:r>
               <w:rPr>
                 <w:sz w:val="16"/>
               </w:rPr>
-              <w:t>RECONFIRM</w:t>
+              <w:t>AMBIGUOUS; reconfirm session facts</w:t>
             </w:r>
           </w:p>
         </w:tc>
@@ -3249,14 +3060,11 @@
             <w:shd w:fill="F3F6FA"/>
           </w:tcPr>
           <w:p>
-            <w:pPr>
-              <w:spacing w:after="20"/>
-            </w:pPr>
             <w:r>
               <w:rPr>
                 <w:sz w:val="16"/>
               </w:rPr>
-              <w:t>CONFIRM TRANSCRIPT</w:t>
+              <w:t>Confirm transcript before normal gates</w:t>
             </w:r>
           </w:p>
         </w:tc>
@@ -3323,14 +3131,11 @@
             <w:vAlign w:val="center"/>
           </w:tcPr>
           <w:p>
-            <w:pPr>
-              <w:spacing w:after="20"/>
-            </w:pPr>
             <w:r>
               <w:rPr>
                 <w:sz w:val="16"/>
               </w:rPr>
-              <w:t>CLOSE</w:t>
+              <w:t>Close as rider-reported resolution</w:t>
             </w:r>
           </w:p>
         </w:tc>
@@ -3399,14 +3204,11 @@
             <w:shd w:fill="F3F6FA"/>
           </w:tcPr>
           <w:p>
-            <w:pPr>
-              <w:spacing w:after="20"/>
-            </w:pPr>
             <w:r>
               <w:rPr>
                 <w:sz w:val="16"/>
               </w:rPr>
-              <w:t>ABSTAIN+OEM</w:t>
+              <w:t>UNSUPPORTED and verified OEM support</w:t>
             </w:r>
           </w:p>
         </w:tc>
@@ -3440,6 +3242,9 @@
         <w:pStyle w:val="Heading1"/>
       </w:pPr>
       <w:r>
+        <w:rPr>
+          <w:color w:val="000000"/>
+        </w:rPr>
         <w:t>3  Architecture decision register: choice, alternatives and reversal triggers</w:t>
       </w:r>
     </w:p>
@@ -3466,6 +3271,9 @@
             <w:shd w:fill="102238"/>
           </w:tcPr>
           <w:p>
+            <w:pPr>
+              <w:keepNext/>
+            </w:pPr>
             <w:r>
               <w:rPr>
                 <w:b/>
@@ -3519,9 +3327,6 @@
             <w:vAlign w:val="center"/>
           </w:tcPr>
           <w:p>
-            <w:pPr>
-              <w:spacing w:after="20"/>
-            </w:pPr>
             <w:r>
               <w:rPr>
                 <w:sz w:val="16"/>
@@ -3536,14 +3341,11 @@
             <w:vAlign w:val="center"/>
           </w:tcPr>
           <w:p>
-            <w:pPr>
-              <w:spacing w:after="20"/>
-            </w:pPr>
             <w:r>
               <w:rPr>
                 <w:sz w:val="16"/>
               </w:rPr>
-              <w:t>Docling layout-aware</w:t>
+              <w:t>Docling in hosted ingestion; flagged whole-page fallback for PDF 103</w:t>
             </w:r>
           </w:p>
         </w:tc>
@@ -3553,14 +3355,11 @@
             <w:vAlign w:val="center"/>
           </w:tcPr>
           <w:p>
-            <w:pPr>
-              <w:spacing w:after="20"/>
-            </w:pPr>
             <w:r>
               <w:rPr>
                 <w:sz w:val="16"/>
               </w:rPr>
-              <w:t>Google Document AI if critical tables and figures repeatedly fail extraction</w:t>
+              <w:t>Other layout parsers or Document AI only after reviewed extraction comparison; fallback is unapproved source context</w:t>
             </w:r>
           </w:p>
         </w:tc>
@@ -3576,9 +3375,6 @@
             <w:shd w:fill="F3F6FA"/>
           </w:tcPr>
           <w:p>
-            <w:pPr>
-              <w:spacing w:after="20"/>
-            </w:pPr>
             <w:r>
               <w:rPr>
                 <w:sz w:val="16"/>
@@ -3594,14 +3390,11 @@
             <w:shd w:fill="F3F6FA"/>
           </w:tcPr>
           <w:p>
-            <w:pPr>
-              <w:spacing w:after="20"/>
-            </w:pPr>
             <w:r>
               <w:rPr>
                 <w:sz w:val="16"/>
               </w:rPr>
-              <w:t>Typed, hierarchical parent-child</w:t>
+              <w:t>1,024-token parent-child search chunks with section context</w:t>
             </w:r>
           </w:p>
         </w:tc>
@@ -3612,14 +3405,11 @@
             <w:shd w:fill="F3F6FA"/>
           </w:tcPr>
           <w:p>
-            <w:pPr>
-              <w:spacing w:after="20"/>
-            </w:pPr>
             <w:r>
               <w:rPr>
                 <w:sz w:val="16"/>
               </w:rPr>
-              <w:t>Fixed-size / late chunking if gold-set complete evidence recall improves</w:t>
+              <w:t>Procedure parents still unreviewed; compare alternatives on warning/condition completeness</w:t>
             </w:r>
           </w:p>
         </w:tc>
@@ -3634,9 +3424,6 @@
             <w:vAlign w:val="center"/>
           </w:tcPr>
           <w:p>
-            <w:pPr>
-              <w:spacing w:after="20"/>
-            </w:pPr>
             <w:r>
               <w:rPr>
                 <w:sz w:val="16"/>
@@ -3651,14 +3438,11 @@
             <w:vAlign w:val="center"/>
           </w:tcPr>
           <w:p>
-            <w:pPr>
-              <w:spacing w:after="20"/>
-            </w:pPr>
             <w:r>
               <w:rPr>
                 <w:sz w:val="16"/>
               </w:rPr>
-              <w:t>Dense + BM25 with RRF</w:t>
+              <w:t>BGE M3 cosine + BM25 + RRF, bounded reviewed expansion</w:t>
             </w:r>
           </w:p>
         </w:tc>
@@ -3668,14 +3452,11 @@
             <w:vAlign w:val="center"/>
           </w:tcPr>
           <w:p>
-            <w:pPr>
-              <w:spacing w:after="20"/>
-            </w:pPr>
             <w:r>
               <w:rPr>
                 <w:sz w:val="16"/>
               </w:rPr>
-              <w:t>Dense only if no measurable gain; sparse emphasis for code-heavy manuals</w:t>
+              <w:t>Dense-only/sparse alternatives require same reviewed held-out cases</w:t>
             </w:r>
           </w:p>
         </w:tc>
@@ -3691,9 +3472,6 @@
             <w:shd w:fill="F3F6FA"/>
           </w:tcPr>
           <w:p>
-            <w:pPr>
-              <w:spacing w:after="20"/>
-            </w:pPr>
             <w:r>
               <w:rPr>
                 <w:sz w:val="16"/>
@@ -3709,14 +3487,11 @@
             <w:shd w:fill="F3F6FA"/>
           </w:tcPr>
           <w:p>
-            <w:pPr>
-              <w:spacing w:after="20"/>
-            </w:pPr>
             <w:r>
               <w:rPr>
                 <w:sz w:val="16"/>
               </w:rPr>
-              <w:t>Compact embedding baseline, query/document compatible</w:t>
+              <w:t>BGE M3 selected candidate; 532 chunks and 277 section parents</w:t>
             </w:r>
           </w:p>
         </w:tc>
@@ -3727,14 +3502,11 @@
             <w:shd w:fill="F3F6FA"/>
           </w:tcPr>
           <w:p>
-            <w:pPr>
-              <w:spacing w:after="20"/>
-            </w:pPr>
             <w:r>
               <w:rPr>
                 <w:sz w:val="16"/>
               </w:rPr>
-              <w:t>Domain embedding, Matryoshka or BGE-M3 if eval lift offsets ops cost</w:t>
+              <w:t>MiniLM hybrid 21/27 vs BGE 23/27 draft page coverage; no release-quality claim</w:t>
             </w:r>
           </w:p>
         </w:tc>
@@ -3749,9 +3521,6 @@
             <w:vAlign w:val="center"/>
           </w:tcPr>
           <w:p>
-            <w:pPr>
-              <w:spacing w:after="20"/>
-            </w:pPr>
             <w:r>
               <w:rPr>
                 <w:sz w:val="16"/>
@@ -3766,14 +3535,11 @@
             <w:vAlign w:val="center"/>
           </w:tcPr>
           <w:p>
-            <w:pPr>
-              <w:spacing w:after="20"/>
-            </w:pPr>
             <w:r>
               <w:rPr>
                 <w:sz w:val="16"/>
               </w:rPr>
-              <w:t>Verified section/reference graph</w:t>
+              <w:t>Lightweight provenance graph; only approved dependencies can authorize steps</w:t>
             </w:r>
           </w:p>
         </w:tc>
@@ -3783,14 +3549,11 @@
             <w:vAlign w:val="center"/>
           </w:tcPr>
           <w:p>
-            <w:pPr>
-              <w:spacing w:after="20"/>
-            </w:pPr>
             <w:r>
               <w:rPr>
                 <w:sz w:val="16"/>
               </w:rPr>
-              <w:t>Full GraphRAG only if source scale and complex relations justify complexity</w:t>
+              <w:t>Structural/topic links are context; full GraphRAG requires measured gains and source-verifiable edges</w:t>
             </w:r>
           </w:p>
         </w:tc>
@@ -3806,9 +3569,6 @@
             <w:shd w:fill="F3F6FA"/>
           </w:tcPr>
           <w:p>
-            <w:pPr>
-              <w:spacing w:after="20"/>
-            </w:pPr>
             <w:r>
               <w:rPr>
                 <w:sz w:val="16"/>
@@ -3824,14 +3584,11 @@
             <w:shd w:fill="F3F6FA"/>
           </w:tcPr>
           <w:p>
-            <w:pPr>
-              <w:spacing w:after="20"/>
-            </w:pPr>
             <w:r>
               <w:rPr>
                 <w:sz w:val="16"/>
               </w:rPr>
-              <w:t>Conditional cross-encoder</w:t>
+              <w:t>Owner-approved conditional cross-encoder policy in TRD v0.4</w:t>
             </w:r>
           </w:p>
         </w:tc>
@@ -3842,14 +3599,11 @@
             <w:shd w:fill="F3F6FA"/>
           </w:tcPr>
           <w:p>
-            <w:pPr>
-              <w:spacing w:after="20"/>
-            </w:pPr>
             <w:r>
               <w:rPr>
                 <w:sz w:val="16"/>
               </w:rPr>
-              <w:t>No rerank when marginal lift low; ColBERT for recall/precision gains at acceptable latency</w:t>
+              <w:t>Off/always_diagnostic ablations; current review gaps skip it; calibrate distinct-parent triggers independently</w:t>
             </w:r>
           </w:p>
         </w:tc>
@@ -3864,9 +3618,6 @@
             <w:vAlign w:val="center"/>
           </w:tcPr>
           <w:p>
-            <w:pPr>
-              <w:spacing w:after="20"/>
-            </w:pPr>
             <w:r>
               <w:rPr>
                 <w:sz w:val="16"/>
@@ -3881,14 +3632,11 @@
             <w:vAlign w:val="center"/>
           </w:tcPr>
           <w:p>
-            <w:pPr>
-              <w:spacing w:after="20"/>
-            </w:pPr>
             <w:r>
               <w:rPr>
                 <w:sz w:val="16"/>
               </w:rPr>
-              <w:t>Rules + semantic support verifier</w:t>
+              <w:t>Approved dependency manifest, deterministic checks and final semantic claim validation</w:t>
             </w:r>
           </w:p>
         </w:tc>
@@ -3898,14 +3646,11 @@
             <w:vAlign w:val="center"/>
           </w:tcPr>
           <w:p>
-            <w:pPr>
-              <w:spacing w:after="20"/>
-            </w:pPr>
             <w:r>
               <w:rPr>
                 <w:sz w:val="16"/>
               </w:rPr>
-              <w:t>More constrained templates if false-supported claims persist</w:t>
+              <w:t>No empty/unreviewed set passes; template alternative if false approvals persist</w:t>
             </w:r>
           </w:p>
         </w:tc>
@@ -3921,9 +3666,6 @@
             <w:shd w:fill="F3F6FA"/>
           </w:tcPr>
           <w:p>
-            <w:pPr>
-              <w:spacing w:after="20"/>
-            </w:pPr>
             <w:r>
               <w:rPr>
                 <w:sz w:val="16"/>
@@ -3939,14 +3681,11 @@
             <w:shd w:fill="F3F6FA"/>
           </w:tcPr>
           <w:p>
-            <w:pPr>
-              <w:spacing w:after="20"/>
-            </w:pPr>
             <w:r>
               <w:rPr>
                 <w:sz w:val="16"/>
               </w:rPr>
-              <w:t>Deterministic controller + typed outcomes</w:t>
+              <w:t>Deterministic controller; approved registry; TRUE/FALSE/UNKNOWN predicates</w:t>
             </w:r>
           </w:p>
         </w:tc>
@@ -3957,14 +3696,11 @@
             <w:shd w:fill="F3F6FA"/>
           </w:tcPr>
           <w:p>
-            <w:pPr>
-              <w:spacing w:after="20"/>
-            </w:pPr>
             <w:r>
               <w:rPr>
                 <w:sz w:val="16"/>
               </w:rPr>
-              <w:t>LLM planning only if manual is unstructured and a benchmark demonstrates improvement</w:t>
+              <w:t>Decisions API or Jev may interpret outcomes or rank already eligible steps after benchmarking; never replace authority gates</w:t>
             </w:r>
           </w:p>
         </w:tc>
@@ -4094,9 +3830,6 @@
             <w:vAlign w:val="center"/>
           </w:tcPr>
           <w:p>
-            <w:pPr>
-              <w:spacing w:after="20"/>
-            </w:pPr>
             <w:r>
               <w:rPr>
                 <w:sz w:val="16"/>
@@ -4111,31 +3844,22 @@
             <w:vAlign w:val="center"/>
           </w:tcPr>
           <w:p>
-            <w:pPr>
-              <w:spacing w:after="20"/>
-            </w:pPr>
+            <w:r>
+              <w:t>Private GitHub build; authenticated Qdrant and private Storage; Streamlit UI implemented, hosted rider-session API and live deployment pending</w:t>
+            </w:r>
+          </w:p>
+        </w:tc>
+        <w:tc>
+          <w:tcPr>
+            <w:tcW w:type="dxa" w:w="3341"/>
+            <w:vAlign w:val="center"/>
+          </w:tcPr>
+          <w:p>
             <w:r>
               <w:rPr>
                 <w:sz w:val="16"/>
               </w:rPr>
-              <w:t>Streamlit Community Cloud + Python core</w:t>
-            </w:r>
-          </w:p>
-        </w:tc>
-        <w:tc>
-          <w:tcPr>
-            <w:tcW w:type="dxa" w:w="3341"/>
-            <w:vAlign w:val="center"/>
-          </w:tcPr>
-          <w:p>
-            <w:pPr>
-              <w:spacing w:after="20"/>
-            </w:pPr>
-            <w:r>
-              <w:rPr>
-                <w:sz w:val="16"/>
-              </w:rPr>
-              <w:t>Hugging Face Spaces / FastAPI + managed cloud for stability or concurrency</w:t>
+              <w:t>UI hosting provider remains open; preserve online operation, immutable index, server secrets and project budget</w:t>
             </w:r>
           </w:p>
         </w:tc>
@@ -4151,9 +3875,6 @@
             <w:shd w:fill="F3F6FA"/>
           </w:tcPr>
           <w:p>
-            <w:pPr>
-              <w:spacing w:after="20"/>
-            </w:pPr>
             <w:r>
               <w:rPr>
                 <w:sz w:val="16"/>
@@ -4169,14 +3890,11 @@
             <w:shd w:fill="F3F6FA"/>
           </w:tcPr>
           <w:p>
-            <w:pPr>
-              <w:spacing w:after="20"/>
-            </w:pPr>
             <w:r>
               <w:rPr>
                 <w:sz w:val="16"/>
               </w:rPr>
-              <w:t>OpenTelemetry + Langfuse-style eval backend</w:t>
+              <w:t>TRD RetrievalDecision and eligibility/claim spans; OpenTelemetry-compatible target</w:t>
             </w:r>
           </w:p>
         </w:tc>
@@ -4187,14 +3905,11 @@
             <w:shd w:fill="F3F6FA"/>
           </w:tcPr>
           <w:p>
-            <w:pPr>
-              <w:spacing w:after="20"/>
-            </w:pPr>
             <w:r>
               <w:rPr>
                 <w:sz w:val="16"/>
               </w:rPr>
-              <w:t>Simple JSONL first if backend setup overhead outweighs demo benefit</w:t>
+              <w:t>Simple redacted traces or Langfuse backend; measured integration decision pending</w:t>
             </w:r>
           </w:p>
         </w:tc>
@@ -4207,7 +3922,7 @@
     </w:p>
     <w:p>
       <w:r>
-        <w:t>Every ADR will later record date, dataset ID, measured delta in complete evidence recall, false-supported claim count, p95 latency and cost per correctly handled case. None of these selections should be described as experimentally proven yet.</w:t>
+        <w:t>Record dataset/version, review status, measured recall delta, unsupported eligibility/claim approvals, p95 and cost before changing a choice. Hosted draft diagnostics justify a candidate baseline only. Conditional scheduling is approved as a design policy; thresholds and release activation remain uncalibrated. Parser, retrieval, vision and voice alternatives remain experiments.</w:t>
       </w:r>
     </w:p>
     <w:p>
@@ -4215,6 +3930,9 @@
         <w:pStyle w:val="Heading1"/>
       </w:pPr>
       <w:r>
+        <w:rPr>
+          <w:color w:val="000000"/>
+        </w:rPr>
         <w:t>4  Golden-answer dataset: provisional atomic cases</w:t>
       </w:r>
     </w:p>
@@ -4245,6 +3963,9 @@
             <w:shd w:fill="102238"/>
           </w:tcPr>
           <w:p>
+            <w:pPr>
+              <w:keepNext/>
+            </w:pPr>
             <w:r>
               <w:rPr>
                 <w:b/>
@@ -4362,9 +4083,6 @@
             <w:vAlign w:val="center"/>
           </w:tcPr>
           <w:p>
-            <w:pPr>
-              <w:spacing w:after="20"/>
-            </w:pPr>
             <w:r>
               <w:rPr>
                 <w:sz w:val="16"/>
@@ -4379,14 +4097,11 @@
             <w:vAlign w:val="center"/>
           </w:tcPr>
           <w:p>
-            <w:pPr>
-              <w:spacing w:after="20"/>
-            </w:pPr>
             <w:r>
               <w:rPr>
                 <w:sz w:val="16"/>
               </w:rPr>
-              <w:t>ANSWER / CLARIFY / ABSTAIN / SAFETY_STOP / SYSTEM_ERROR / NEXT_ELIGIBLE / RESOLVED</w:t>
+              <w:t>SUPPORTED / AMBIGUOUS / UNSUPPORTED / SAFETY_STOP / SYSTEM_ERROR; record transition/closure separately</w:t>
             </w:r>
           </w:p>
         </w:tc>
@@ -4442,9 +4157,6 @@
             <w:vAlign w:val="center"/>
           </w:tcPr>
           <w:p>
-            <w:pPr>
-              <w:spacing w:after="20"/>
-            </w:pPr>
             <w:r>
               <w:rPr>
                 <w:sz w:val="16"/>
@@ -4459,14 +4171,11 @@
             <w:vAlign w:val="center"/>
           </w:tcPr>
           <w:p>
-            <w:pPr>
-              <w:spacing w:after="20"/>
-            </w:pPr>
             <w:r>
               <w:rPr>
                 <w:sz w:val="16"/>
               </w:rPr>
-              <w:t>All manual excerpts, prerequisite blocks, diagrams, tables and warnings needed</w:t>
+              <w:t>Approved action and dependency set, dependency manifest/version/review status, required and attached IDs, original-page provenance</w:t>
             </w:r>
           </w:p>
         </w:tc>
@@ -4668,6 +4377,34 @@
                 <w:sz w:val="16"/>
               </w:rPr>
               <w:t>Regression, validation, holdout; basic / multi-hop / vision / high-risk</w:t>
+            </w:r>
+          </w:p>
+        </w:tc>
+      </w:tr>
+      <w:tr>
+        <w:tc>
+          <w:tcPr>
+            <w:tcW w:type="dxa" w:w="5011"/>
+          </w:tcPr>
+          <w:p>
+            <w:r>
+              <w:rPr>
+                <w:sz w:val="16"/>
+              </w:rPr>
+              <w:t>expected_eligibility / rule provenance</w:t>
+            </w:r>
+          </w:p>
+        </w:tc>
+        <w:tc>
+          <w:tcPr>
+            <w:tcW w:type="dxa" w:w="5011"/>
+          </w:tcPr>
+          <w:p>
+            <w:r>
+              <w:rPr>
+                <w:sz w:val="16"/>
+              </w:rPr>
+              <w:t>TRUE/FALSE/UNKNOWN facts, approved rule versions, exclusion reasons, allowed next step, session version and prior immutable attempts</w:t>
             </w:r>
           </w:p>
         </w:tc>
@@ -4688,6 +4425,9 @@
         <w:pStyle w:val="Heading1"/>
       </w:pPr>
       <w:r>
+        <w:rPr>
+          <w:color w:val="000000"/>
+        </w:rPr>
         <w:t>5  KPI contract and definitions</w:t>
       </w:r>
     </w:p>
@@ -4714,6 +4454,9 @@
             <w:shd w:fill="102238"/>
           </w:tcPr>
           <w:p>
+            <w:pPr>
+              <w:keepNext/>
+            </w:pPr>
             <w:r>
               <w:rPr>
                 <w:b/>
@@ -5284,14 +5027,11 @@
             <w:shd w:fill="F3F6FA"/>
           </w:tcPr>
           <w:p>
-            <w:pPr>
-              <w:spacing w:after="20"/>
-            </w:pPr>
             <w:r>
               <w:rPr>
                 <w:sz w:val="16"/>
               </w:rPr>
-              <w:t>Latency (p95)</w:t>
+              <w:t>Latency and TTFO</w:t>
             </w:r>
           </w:p>
         </w:tc>
@@ -5302,14 +5042,11 @@
             <w:shd w:fill="F3F6FA"/>
           </w:tcPr>
           <w:p>
-            <w:pPr>
-              <w:spacing w:after="20"/>
-            </w:pPr>
             <w:r>
               <w:rPr>
                 <w:sz w:val="16"/>
               </w:rPr>
-              <w:t>End-to-end cold/warm separated by modality</w:t>
+              <w:t>Confirmed input to first releasable token; stage and fast/recovery/rerank p50/p95 plus combined p95; cold/warm separate</w:t>
             </w:r>
           </w:p>
         </w:tc>
@@ -5320,14 +5057,11 @@
             <w:shd w:fill="F3F6FA"/>
           </w:tcPr>
           <w:p>
-            <w:pPr>
-              <w:spacing w:after="20"/>
-            </w:pPr>
             <w:r>
               <w:rPr>
                 <w:sz w:val="16"/>
               </w:rPr>
-              <w:t>Warm text &lt;5s; image &lt;10s</w:t>
+              <w:t>Warm text p50 &lt;=2.5s, p95 &lt;=5s; photo p95 &lt;=10s</w:t>
             </w:r>
           </w:p>
         </w:tc>
@@ -5404,6 +5138,9 @@
         <w:pStyle w:val="Heading1"/>
       </w:pPr>
       <w:r>
+        <w:rPr>
+          <w:color w:val="000000"/>
+        </w:rPr>
         <w:t>6  Observability and failure inventory</w:t>
       </w:r>
     </w:p>
@@ -5420,7 +5157,7 @@
         <w:pStyle w:val="ListBullet"/>
       </w:pPr>
       <w:r>
-        <w:t>Retrieval spans: dense/sparse candidates, scores, fused rank, graph edges, compulsory evidence missing, rerank time</w:t>
+        <w:t>Retrieval spans: policy version/config, calibration, distinct-parent uncertainty signals, recovery/rerank decisions and attempts, exact fetched/missing IDs, pair count, skip reason and stage duration.</w:t>
       </w:r>
     </w:p>
     <w:p>
@@ -5428,7 +5165,7 @@
         <w:pStyle w:val="ListBullet"/>
       </w:pPr>
       <w:r>
-        <w:t>Decision spans: step eligibility, excluded prior checks, chosen next step, failed prerequisites, support verdict, citation mapping</w:t>
+        <w:t>Decision spans: candidate step IDs, TRUE/FALSE/UNKNOWN conditions, exclusion reason codes, rule/dependency/session versions, chosen eligible step, support verdict and claim mapping.</w:t>
       </w:r>
     </w:p>
     <w:p>
@@ -5452,7 +5189,7 @@
         <w:pStyle w:val="ListBullet"/>
       </w:pPr>
       <w:r>
-        <w:t>Track cost per outcome and p95 per stage; do not expose raw user photos/audio or access secrets in logs</w:t>
+        <w:t>Track confirmed-input TTFO, path and combined p95, cold starts, fallback frequency and cost per correctly handled case; keep raw media and secrets out of logs.</w:t>
       </w:r>
     </w:p>
     <w:p>
@@ -5460,6 +5197,9 @@
         <w:pStyle w:val="Heading1"/>
       </w:pPr>
       <w:r>
+        <w:rPr>
+          <w:color w:val="000000"/>
+        </w:rPr>
         <w:t>7  Required source inventory before build</w:t>
       </w:r>
     </w:p>
@@ -5486,6 +5226,9 @@
             <w:shd w:fill="102238"/>
           </w:tcPr>
           <w:p>
+            <w:pPr>
+              <w:keepNext/>
+            </w:pPr>
             <w:r>
               <w:rPr>
                 <w:b/>
@@ -5826,9 +5569,6 @@
             <w:shd w:fill="F3F6FA"/>
           </w:tcPr>
           <w:p>
-            <w:pPr>
-              <w:spacing w:after="20"/>
-            </w:pPr>
             <w:r>
               <w:rPr>
                 <w:sz w:val="16"/>
@@ -5844,14 +5584,11 @@
             <w:shd w:fill="F3F6FA"/>
           </w:tcPr>
           <w:p>
-            <w:pPr>
-              <w:spacing w:after="20"/>
-            </w:pPr>
             <w:r>
               <w:rPr>
                 <w:sz w:val="16"/>
               </w:rPr>
-              <w:t>Developer</w:t>
+              <w:t>Developer / authorized GCP project</w:t>
             </w:r>
           </w:p>
         </w:tc>
@@ -5862,14 +5599,11 @@
             <w:shd w:fill="F3F6FA"/>
           </w:tcPr>
           <w:p>
-            <w:pPr>
-              <w:spacing w:after="20"/>
-            </w:pPr>
             <w:r>
               <w:rPr>
                 <w:sz w:val="16"/>
               </w:rPr>
-              <w:t>Stored in secret manager; no repo commitment</w:t>
+              <w:t>Server secrets; INR800 lifetime budget and live stop INR640; per-day/UI limits pending</w:t>
             </w:r>
           </w:p>
         </w:tc>
@@ -6000,6 +5734,9 @@
         <w:pStyle w:val="Heading1"/>
       </w:pPr>
       <w:r>
+        <w:rPr>
+          <w:color w:val="000000"/>
+        </w:rPr>
         <w:t>8  Weekend-oriented implementation workplan</w:t>
       </w:r>
     </w:p>
@@ -6026,6 +5763,9 @@
             <w:shd w:fill="102238"/>
           </w:tcPr>
           <w:p>
+            <w:pPr>
+              <w:keepNext/>
+            </w:pPr>
             <w:r>
               <w:rPr>
                 <w:b/>
@@ -6079,9 +5819,6 @@
             <w:vAlign w:val="center"/>
           </w:tcPr>
           <w:p>
-            <w:pPr>
-              <w:spacing w:after="20"/>
-            </w:pPr>
             <w:r>
               <w:rPr>
                 <w:sz w:val="16"/>
@@ -6096,14 +5833,11 @@
             <w:vAlign w:val="center"/>
           </w:tcPr>
           <w:p>
-            <w:pPr>
-              <w:spacing w:after="20"/>
-            </w:pPr>
             <w:r>
               <w:rPr>
                 <w:sz w:val="16"/>
               </w:rPr>
-              <w:t>Inspect structure, warnings, figures, cross-reference density, variants</w:t>
+              <w:t>Exact manual supplied; checksum verified; review difficult pages and dependencies; confirm metadata/rights/support</w:t>
             </w:r>
           </w:p>
         </w:tc>
@@ -6113,14 +5847,11 @@
             <w:vAlign w:val="center"/>
           </w:tcPr>
           <w:p>
-            <w:pPr>
-              <w:spacing w:after="20"/>
-            </w:pPr>
             <w:r>
               <w:rPr>
                 <w:sz w:val="16"/>
               </w:rPr>
-              <w:t>Choose source and 10 high-value seed questions</w:t>
+              <w:t>Confirmed manifest and ten reviewed seed questions; remaining fields still open</w:t>
             </w:r>
           </w:p>
         </w:tc>
@@ -6136,14 +5867,11 @@
             <w:shd w:fill="F3F6FA"/>
           </w:tcPr>
           <w:p>
-            <w:pPr>
-              <w:spacing w:after="20"/>
-            </w:pPr>
             <w:r>
               <w:rPr>
                 <w:sz w:val="16"/>
               </w:rPr>
-              <w:t>B: Index + grounding</w:t>
+              <w:t>B: Index and grounding</w:t>
             </w:r>
           </w:p>
         </w:tc>
@@ -6154,14 +5882,11 @@
             <w:shd w:fill="F3F6FA"/>
           </w:tcPr>
           <w:p>
-            <w:pPr>
-              <w:spacing w:after="20"/>
-            </w:pPr>
             <w:r>
               <w:rPr>
                 <w:sz w:val="16"/>
               </w:rPr>
-              <w:t>Parse, typed objects, page registry, embeddings, BM25, citation renderer</w:t>
+              <w:t>Hosted candidate index built; approve procedure/step dependencies and test applicable factual answers</w:t>
             </w:r>
           </w:p>
         </w:tc>
@@ -6172,14 +5897,11 @@
             <w:shd w:fill="F3F6FA"/>
           </w:tcPr>
           <w:p>
-            <w:pPr>
-              <w:spacing w:after="20"/>
-            </w:pPr>
             <w:r>
               <w:rPr>
                 <w:sz w:val="16"/>
               </w:rPr>
-              <w:t>5 direct/manual questions pass with source links</w:t>
+              <w:t>Five independently reviewed direct questions return source-linked answers or justified routes</w:t>
             </w:r>
           </w:p>
         </w:tc>
@@ -6194,9 +5916,6 @@
             <w:vAlign w:val="center"/>
           </w:tcPr>
           <w:p>
-            <w:pPr>
-              <w:spacing w:after="20"/>
-            </w:pPr>
             <w:r>
               <w:rPr>
                 <w:sz w:val="16"/>
@@ -6211,14 +5930,11 @@
             <w:vAlign w:val="center"/>
           </w:tcPr>
           <w:p>
-            <w:pPr>
-              <w:spacing w:after="20"/>
-            </w:pPr>
             <w:r>
               <w:rPr>
                 <w:sz w:val="16"/>
               </w:rPr>
-              <w:t>Outcome enum, attempt history, explicit NEXT_STEP edges, non-repeat policy</w:t>
+              <w:t>Prototype exists; integrate approved rules, three-valued eligibility and immutable attempt store</w:t>
             </w:r>
           </w:p>
         </w:tc>
@@ -6228,14 +5944,52 @@
             <w:vAlign w:val="center"/>
           </w:tcPr>
           <w:p>
-            <w:pPr>
-              <w:spacing w:after="20"/>
-            </w:pPr>
             <w:r>
               <w:rPr>
                 <w:sz w:val="16"/>
               </w:rPr>
-              <w:t>3 multi-turn scenarios behave correctly</w:t>
+              <w:t>Three reviewed multi-turn cases correctly advance, clarify or escalate without unjustified repeats</w:t>
+            </w:r>
+          </w:p>
+        </w:tc>
+      </w:tr>
+      <w:tr>
+        <w:tc>
+          <w:tcPr>
+            <w:tcW w:type="dxa" w:w="3341"/>
+          </w:tcPr>
+          <w:p>
+            <w:r>
+              <w:rPr>
+                <w:sz w:val="16"/>
+              </w:rPr>
+              <w:t>C2: Guardrails and cache</w:t>
+            </w:r>
+          </w:p>
+        </w:tc>
+        <w:tc>
+          <w:tcPr>
+            <w:tcW w:type="dxa" w:w="3341"/>
+          </w:tcPr>
+          <w:p>
+            <w:r>
+              <w:rPr>
+                <w:sz w:val="16"/>
+              </w:rPr>
+              <w:t>Integrate applicability/evidence/safety/claim gates, exact-cache approval and invalidation, injection/privacy/failure checks</w:t>
+            </w:r>
+          </w:p>
+        </w:tc>
+        <w:tc>
+          <w:tcPr>
+            <w:tcW w:type="dxa" w:w="3341"/>
+          </w:tcPr>
+          <w:p>
+            <w:r>
+              <w:rPr>
+                <w:sz w:val="16"/>
+              </w:rPr>
+              <w:t>Reviewed paths hit exactly; draft/stale/mismatched paths miss; safety regressions pass</w:t>
             </w:r>
           </w:p>
         </w:tc>
@@ -6251,14 +6005,11 @@
             <w:shd w:fill="F3F6FA"/>
           </w:tcPr>
           <w:p>
-            <w:pPr>
-              <w:spacing w:after="20"/>
-            </w:pPr>
             <w:r>
               <w:rPr>
                 <w:sz w:val="16"/>
               </w:rPr>
-              <w:t>D: Multimodal + sharing</w:t>
+              <w:t>D: Multimodal and sharing</w:t>
             </w:r>
           </w:p>
         </w:tc>
@@ -6269,32 +6020,23 @@
             <w:shd w:fill="F3F6FA"/>
           </w:tcPr>
           <w:p>
-            <w:pPr>
-              <w:spacing w:after="20"/>
-            </w:pPr>
+            <w:r>
+              <w:t>Text UI and safeguard components tested; install managed sessions, identity/rate/spend/retention controls; photos remain disabled until live text gate passes</w:t>
+            </w:r>
+          </w:p>
+        </w:tc>
+        <w:tc>
+          <w:tcPr>
+            <w:tcW w:type="dxa" w:w="3341"/>
+            <w:vAlign w:val="center"/>
+            <w:shd w:fill="F3F6FA"/>
+          </w:tcPr>
+          <w:p>
             <w:r>
               <w:rPr>
                 <w:sz w:val="16"/>
               </w:rPr>
-              <w:t>Photo interpreter; Streamlit; host + secrets; optional voice</w:t>
-            </w:r>
-          </w:p>
-        </w:tc>
-        <w:tc>
-          <w:tcPr>
-            <w:tcW w:type="dxa" w:w="3341"/>
-            <w:vAlign w:val="center"/>
-            <w:shd w:fill="F3F6FA"/>
-          </w:tcPr>
-          <w:p>
-            <w:pPr>
-              <w:spacing w:after="20"/>
-            </w:pPr>
-            <w:r>
-              <w:rPr>
-                <w:sz w:val="16"/>
-              </w:rPr>
-              <w:t>Independent live-URL photo/text smoke test</w:t>
+              <w:t>Fresh logged-out browser at shareable URL passes text, follow-up, photo, abstention and error tests</w:t>
             </w:r>
           </w:p>
         </w:tc>
@@ -6425,6 +6167,9 @@
         <w:pStyle w:val="Heading1"/>
       </w:pPr>
       <w:r>
+        <w:rPr>
+          <w:color w:val="000000"/>
+        </w:rPr>
         <w:t>9  Release check and demo script</w:t>
       </w:r>
     </w:p>
@@ -6489,6 +6234,9 @@
         <w:pStyle w:val="Heading1"/>
       </w:pPr>
       <w:r>
+        <w:rPr>
+          <w:color w:val="000000"/>
+        </w:rPr>
         <w:t>10  Known limitations and honest claims</w:t>
       </w:r>
     </w:p>
@@ -6529,6 +6277,9 @@
         <w:pStyle w:val="Heading1"/>
       </w:pPr>
       <w:r>
+        <w:rPr>
+          <w:color w:val="000000"/>
+        </w:rPr>
         <w:t>11  Guardrail implementation checklist</w:t>
       </w:r>
     </w:p>
@@ -6553,7 +6304,7 @@
         <w:pStyle w:val="ListBullet"/>
       </w:pPr>
       <w:r>
-        <w:t>G-03  Gate every proposed technical step on applicability, complete evidence, relevant cautions and claim-level citation support; reject unsupported drafts.</w:t>
+        <w:t>G-03  Require approved StepDefinition/ApplicabilityRule predicates and a complete reviewed dependency manifest, then deterministic and semantic claim checks; source gaps block and enter review.</w:t>
       </w:r>
     </w:p>
     <w:p>
@@ -6561,7 +6312,7 @@
         <w:pStyle w:val="ListBullet"/>
       </w:pPr>
       <w:r>
-        <w:t>G-04  Implement deterministic typed diagnostic transitions, one question at a time, with no unjustified repeat after 'tried but still failing'.</w:t>
+        <w:t>G-04  Implement TRUE/FALSE/UNKNOWN eligibility, immutable superseding corrections, typed outcomes and no unjustified repetition; prefer explicit OEM order without inventing one.</w:t>
       </w:r>
     </w:p>
     <w:p>
@@ -6569,7 +6320,7 @@
         <w:pStyle w:val="ListBullet"/>
       </w:pPr>
       <w:r>
-        <w:t>G-05  Separate supported answer, clarification, unsupported request, safety stop and system error in both UI and telemetry.</w:t>
+        <w:t>G-05  Keep SUPPORTED, AMBIGUOUS, UNSUPPORTED, SAFETY_STOP and SYSTEM_ERROR distinct; preserve verified safety-stop precedence; source review is not rider-resolvable.</w:t>
       </w:r>
     </w:p>
     <w:p>
@@ -6609,6 +6360,9 @@
         <w:pStyle w:val="Heading1"/>
       </w:pPr>
       <w:r>
+        <w:rPr>
+          <w:color w:val="000000"/>
+        </w:rPr>
         <w:t>Reference documentation</w:t>
       </w:r>
     </w:p>
@@ -6714,9 +6468,559 @@
         <w:t>https://langfuse.com/docs/evaluation/experiments/datasets</w:t>
       </w:r>
     </w:p>
+    <w:p>
+      <w:pPr>
+        <w:pStyle w:val="Heading1"/>
+      </w:pPr>
+      <w:r>
+        <w:rPr>
+          <w:color w:val="000000"/>
+        </w:rPr>
+        <w:t>Current hosted status and bounded policy</w:t>
+      </w:r>
+    </w:p>
+    <w:p>
+      <w:r>
+        <w:t>Hosted ingestion and embedding comparisons are complete. The selected BGE M3 index index_a3282c4d98cf54595e4ba168 has 532 search chunks and 277 section parents at a 1,024-token budget. Authenticated Cloud Run Qdrant serves immutable vectors from private Cloud Storage with min zero and max one instance; cold starts restore vectors without reparsing or re-embedding. The recorded backend smoke report passes 11/11 checks. Rider UI, integrated eligibility controller and gated generator remain pending; may_generate_procedural_advice stays false.</w:t>
+      </w:r>
+    </w:p>
+    <w:p>
+      <w:r>
+        <w:t>Section parents are contextual candidates. Independent review must establish procedure boundaries and approve StepDefinition, ApplicabilityRule and per-step dependency manifests against the original pages. A missing, empty, stale or unapproved dependency set cannot establish sufficiency. PDF page 103 has a flagged whole-page text/image fallback after Docling omission. Confirm year, market, variant, edition, source URL, display/hosting rights and the OEM service route before public advice.</w:t>
+      </w:r>
+    </w:p>
+    <w:p>
+      <w:r>
+        <w:t>Use dense cosine retrieval plus BM25 and RRF, initial parent/dependency assembly, source and applicability checks, at most one exact-ID recovery for approved missing dependencies, and at most one conditional cross-encoder attempt for uncertain ordering. Reassemble while retaining mandatory evidence. Missing review must not trigger reranking. Conditional is the normal policy; off and always_diagnostic are ablations. Current unreviewed bundles skip reranking and block technical generation.</w:t>
+      </w:r>
+    </w:p>
+    <w:p>
+      <w:r>
+        <w:t>Provisional retrieval bounds are fused pool 20, five assembled hits, recovery pool 40, rerank pool 20, 100 query/passage pairs and 256 mandatory dependency IDs. More than 256 dependencies yields SYSTEM_ERROR without truncation. Distinct-parent top-three overlap below 0.5 or relative RRF margin at most 0.05 are PROVISIONAL_UNCALIBRATED. Zero BM25 matches provide no agreement signal. Queries beyond the current cross-encoder 128-token bound skip inference with an explicit reason and retain full input. Independently reviewed calibration and held-out evaluation remain required.</w:t>
+      </w:r>
+    </w:p>
+    <w:p>
+      <w:r>
+        <w:t>Measure warm text p50 &lt;=2.5 seconds and p95 &lt;=5 seconds, photo p95 &lt;=10 seconds, with cold starts separate. TTFO runs from confirmed input to the first releasable answer token; loading indicators do not count and technical tokens remain withheld until validation. Report fast, recovery/rerank and combined p95, fallback frequency, stage failures and cost per correctly handled case.</w:t>
+      </w:r>
+    </w:p>
+    <w:p>
+      <w:r>
+        <w:t>Exact reviewed paths are keyed by manual checksum, confirmed variant, intent/relevant symptoms, typed outcomes, flow/controller and policy versions, with prompt and approval dependencies. Draft, stale and mismatched entries miss closed. Changes to rules, review, dependencies or policy invalidate affected cache entries and cases. Manual checksum, parser/chunker or embedding changes create a new index version; unchanged document vectors are reused for retrieval-policy changes.</w:t>
+      </w:r>
+    </w:p>
+    <w:p>
+      <w:r>
+        <w:t>The authorized private repository is Maneshwar-Kumar/motomedic-ai and the GCP project is motomedic-ai-20261009, under a US$10 project limit. The non-recurring INR800 budget starts 9 October 2026, alerts at INR400/640/800 and uses a simulation-checked live billing-disconnect guard at INR640 with retry delivery. Delayed reporting prevents an instantaneous exact cap. Do not re-enable billing after a real budget stop without owner authorization. Add per-user rate, upload and per-day spend limits before the public UI.</w:t>
+      </w:r>
+    </w:p>
+    <w:p>
+      <w:pPr>
+        <w:pStyle w:val="Heading1"/>
+      </w:pPr>
+      <w:r>
+        <w:rPr>
+          <w:color w:val="000000"/>
+        </w:rPr>
+        <w:t>Reconciliation change record 9 October 2026</w:t>
+      </w:r>
+    </w:p>
+    <w:p>
+      <w:r>
+        <w:t>These changes reconcile earlier planning language with TRD v0.4 and recorded project evidence. They do not claim new runtime functionality or source approval.</w:t>
+      </w:r>
+    </w:p>
+    <w:p>
+      <w:pPr>
+        <w:pStyle w:val="Heading2"/>
+      </w:pPr>
+      <w:r>
+        <w:rPr>
+          <w:color w:val="000000"/>
+        </w:rPr>
+        <w:t>Document authority</w:t>
+      </w:r>
+    </w:p>
+    <w:p>
+      <w:pPr>
+        <w:keepNext/>
+      </w:pPr>
+      <w:r>
+        <w:t>Previously: Four v0.2 drafts lacked a clear precedence rule.</w:t>
+      </w:r>
+    </w:p>
+    <w:p>
+      <w:r>
+        <w:t>Now: TRD v0.4 governs design and technical contracts; other documents refreshed to v0.3; manual remains the authority for bike facts.</w:t>
+      </w:r>
+    </w:p>
+    <w:p>
+      <w:pPr>
+        <w:pStyle w:val="Heading2"/>
+      </w:pPr>
+      <w:r>
+        <w:rPr>
+          <w:color w:val="000000"/>
+        </w:rPr>
+        <w:t>Build and hosting</w:t>
+      </w:r>
+    </w:p>
+    <w:p>
+      <w:pPr>
+        <w:keepNext/>
+      </w:pPr>
+      <w:r>
+        <w:t>Previously: Offline ingestion wording and Streamlit Community Cloud as the provisional host; local NumPy/LSA baseline.</w:t>
+      </w:r>
+    </w:p>
+    <w:p>
+      <w:r>
+        <w:t>Now: Hosted versioned GitHub ingestion; authenticated Cloud Run Qdrant with private Storage; Streamlit rider UI still pending.</w:t>
+      </w:r>
+    </w:p>
+    <w:p>
+      <w:pPr>
+        <w:pStyle w:val="Heading2"/>
+      </w:pPr>
+      <w:r>
+        <w:rPr>
+          <w:color w:val="000000"/>
+        </w:rPr>
+        <w:t>Embeddings and chunking</w:t>
+      </w:r>
+    </w:p>
+    <w:p>
+      <w:pPr>
+        <w:keepNext/>
+      </w:pPr>
+      <w:r>
+        <w:t>Previously: Compact embedding baseline; hierarchical chunking without a selected hosted budget.</w:t>
+      </w:r>
+    </w:p>
+    <w:p>
+      <w:r>
+        <w:t>Now: BGE M3 candidate selected with 1,024-token chunks, 532 search children and 277 section parents; reviewed procedure boundaries still pending.</w:t>
+      </w:r>
+    </w:p>
+    <w:p>
+      <w:pPr>
+        <w:pStyle w:val="Heading2"/>
+      </w:pPr>
+      <w:r>
+        <w:rPr>
+          <w:color w:val="000000"/>
+        </w:rPr>
+        <w:t>Reranking</w:t>
+      </w:r>
+    </w:p>
+    <w:p>
+      <w:pPr>
+        <w:keepNext/>
+      </w:pPr>
+      <w:r>
+        <w:t>Previously: Generic conditional reranker or local lexical second pass with no explicit scheduling contract.</w:t>
+      </w:r>
+    </w:p>
+    <w:p>
+      <w:r>
+        <w:t>Now: One exact dependency recovery and one conditional cross-encoder attempt; source review first; distinct-parent triggers provisional; mandatory evidence survives reassembly.</w:t>
+      </w:r>
+    </w:p>
+    <w:p>
+      <w:pPr>
+        <w:pStyle w:val="Heading2"/>
+      </w:pPr>
+      <w:r>
+        <w:rPr>
+          <w:color w:val="000000"/>
+        </w:rPr>
+        <w:t>Evidence sufficiency</w:t>
+      </w:r>
+    </w:p>
+    <w:p>
+      <w:pPr>
+        <w:keepNext/>
+      </w:pPr>
+      <w:r>
+        <w:t>Previously: Attach prerequisites/warnings and verify claims without an explicit approved dependency manifest.</w:t>
+      </w:r>
+    </w:p>
+    <w:p>
+      <w:r>
+        <w:t>Now: Required/attached/missing IDs plus manifest version/review; empty or unreviewed set fails closed; page presence alone is insufficient.</w:t>
+      </w:r>
+    </w:p>
+    <w:p>
+      <w:pPr>
+        <w:pStyle w:val="Heading2"/>
+      </w:pPr>
+      <w:r>
+        <w:rPr>
+          <w:color w:val="000000"/>
+        </w:rPr>
+        <w:t>Controller authority</w:t>
+      </w:r>
+    </w:p>
+    <w:p>
+      <w:pPr>
+        <w:keepNext/>
+      </w:pPr>
+      <w:r>
+        <w:t>Previously: Deterministic state machine described broadly; no approved rule registry or three-valued contract.</w:t>
+      </w:r>
+    </w:p>
+    <w:p>
+      <w:r>
+        <w:t>Now: Approved StepDefinition and ApplicabilityRule records; TRUE/FALSE/UNKNOWN predicates; eligibility distinct from evidence and final validation.</w:t>
+      </w:r>
+    </w:p>
+    <w:p>
+      <w:pPr>
+        <w:pStyle w:val="Heading2"/>
+      </w:pPr>
+      <w:r>
+        <w:rPr>
+          <w:color w:val="000000"/>
+        </w:rPr>
+        <w:t>Clarification and failure routing</w:t>
+      </w:r>
+    </w:p>
+    <w:p>
+      <w:pPr>
+        <w:keepNext/>
+      </w:pPr>
+      <w:r>
+        <w:t>Previously: Partial evidence could clarify; answer/clarify/abstain aliases and unsafe/unsupported merged in the diagram.</w:t>
+      </w:r>
+    </w:p>
+    <w:p>
+      <w:r>
+        <w:t>Now: Five canonical statuses; safety-stop precedence; rider questions only for resolvable facts; source gaps block; outages stay SYSTEM_ERROR.</w:t>
+      </w:r>
+    </w:p>
+    <w:p>
+      <w:pPr>
+        <w:pStyle w:val="Heading2"/>
+      </w:pPr>
+      <w:r>
+        <w:rPr>
+          <w:color w:val="000000"/>
+        </w:rPr>
+        <w:t>Corrections and release priorities</w:t>
+      </w:r>
+    </w:p>
+    <w:p>
+      <w:pPr>
+        <w:keepNext/>
+      </w:pPr>
+      <w:r>
+        <w:t>Previously: Correction/backtracking P1; caching and tracing positioned as enhancements.</w:t>
+      </w:r>
+    </w:p>
+    <w:p>
+      <w:r>
+        <w:t>Now: Corrections P0 under immutable attempts; basic tracing/cache rejection required before release; optional voice and expanded cache coverage remain P1.</w:t>
+      </w:r>
+    </w:p>
+    <w:p>
+      <w:pPr>
+        <w:pStyle w:val="Heading2"/>
+      </w:pPr>
+      <w:r>
+        <w:rPr>
+          <w:color w:val="000000"/>
+        </w:rPr>
+        <w:t>Caching and versioning</w:t>
+      </w:r>
+    </w:p>
+    <w:p>
+      <w:pPr>
+        <w:keepNext/>
+      </w:pPr>
+      <w:r>
+        <w:t>Previously: Checksum/variant/path/prompt keys with incomplete review and dependency invalidation detail.</w:t>
+      </w:r>
+    </w:p>
+    <w:p>
+      <w:r>
+        <w:t>Now: Only independently reviewed exact paths; affected rule/review/dependency/policy changes invalidate cache; policy updates reuse unchanged vectors.</w:t>
+      </w:r>
+    </w:p>
+    <w:p>
+      <w:pPr>
+        <w:pStyle w:val="Heading2"/>
+      </w:pPr>
+      <w:r>
+        <w:rPr>
+          <w:color w:val="000000"/>
+        </w:rPr>
+        <w:t>Evaluation and latency</w:t>
+      </w:r>
+    </w:p>
+    <w:p>
+      <w:pPr>
+        <w:keepNext/>
+      </w:pPr>
+      <w:r>
+        <w:t>Previously: Provisional targets with generic rerank comparisons and no TTFO definition.</w:t>
+      </w:r>
+    </w:p>
+    <w:p>
+      <w:r>
+        <w:t>Now: Retain targets; reviewed eligibility/assembly regressions, off/always/conditional held-out evaluation, first releasable token timing and separate/combined path p95.</w:t>
+      </w:r>
+    </w:p>
+    <w:p>
+      <w:pPr>
+        <w:pStyle w:val="Heading2"/>
+      </w:pPr>
+      <w:r>
+        <w:rPr>
+          <w:color w:val="000000"/>
+        </w:rPr>
+        <w:t>Spending</w:t>
+      </w:r>
+    </w:p>
+    <w:p>
+      <w:pPr>
+        <w:keepNext/>
+      </w:pPr>
+      <w:r>
+        <w:t>Previously: Budget to be decided after provider selection.</w:t>
+      </w:r>
+    </w:p>
+    <w:p>
+      <w:r>
+        <w:t>Now: Authorized US$10 project scope, INR800 non-recurring budget, alerts INR400/640/800, live guard INR640; delayed reporting caveat; UI daily limits pending.</w:t>
+      </w:r>
+    </w:p>
+    <w:p>
+      <w:pPr>
+        <w:pStyle w:val="Heading2"/>
+      </w:pPr>
+      <w:r>
+        <w:rPr>
+          <w:color w:val="000000"/>
+        </w:rPr>
+        <w:t>Reported progress</w:t>
+      </w:r>
+    </w:p>
+    <w:p>
+      <w:pPr>
+        <w:keepNext/>
+      </w:pPr>
+      <w:r>
+        <w:t>Previously: Index, deployment and documentation inventory largely marked to build.</w:t>
+      </w:r>
+    </w:p>
+    <w:p>
+      <w:r>
+        <w:t>Now: Hosted candidate build and recorded 11/11 backend checks complete; source approvals, UI, integrated controller/generator, holdout and public release remain open.</w:t>
+      </w:r>
+    </w:p>
+    <w:p>
+      <w:r>
+        <w:br w:type="page"/>
+      </w:r>
+    </w:p>
+    <w:p>
+      <w:pPr>
+        <w:pStyle w:val="Heading1"/>
+      </w:pPr>
+      <w:r>
+        <w:t>Rider UI and safeguards reconciliation 11 October 2026</w:t>
+      </w:r>
+    </w:p>
+    <w:p>
+      <w:r>
+        <w:t>This dated update reconciles the owner's UI, context, input-limit, system-prompt and guardrail requests with current implementation evidence. It supersedes historical progress statuses, without changing TRD v0.4 evidence contracts or the exact 161 approved initial and source scopes. The current working checklist is TODO.md.</w:t>
+      </w:r>
+    </w:p>
+    <w:p>
+      <w:pPr>
+        <w:pStyle w:val="Heading2"/>
+      </w:pPr>
+      <w:r>
+        <w:t>Completed components</w:t>
+      </w:r>
+    </w:p>
+    <w:p>
+      <w:pPr>
+        <w:pStyle w:val="ListBullet"/>
+      </w:pPr>
+      <w:r>
+        <w:t>The text chat input is inside What are you noticing. Category help text is removed; the accessible topic dropdown remains. Saved owner HTML wording and field-level removals are preserved.</w:t>
+      </w:r>
+    </w:p>
+    <w:p>
+      <w:pPr>
+        <w:pStyle w:val="ListBullet"/>
+      </w:pPr>
+      <w:r>
+        <w:t>Start a new conversation clears displayed messages and detaches the active diagnostic session, pending and error state. Bike/manual confirmation may remain. It does not delete stored records or reset visitor limits; reset is disabled while an operation is unresolved.</w:t>
+      </w:r>
+    </w:p>
+    <w:p>
+      <w:pPr>
+        <w:pStyle w:val="ListBullet"/>
+      </w:pPr>
+      <w:r>
+        <w:t>The UI and client enforce 2,000-character messages. Reusable hosted validators check text encoding, JSON byte limits, photo MIME and decoding, animation, image dimensions, pixels and compressed bytes. Photo support remains disabled.</w:t>
+      </w:r>
+    </w:p>
+    <w:p>
+      <w:pPr>
+        <w:pStyle w:val="ListBullet"/>
+      </w:pPr>
+      <w:r>
+        <w:t>Atomic admission checks cover visitor and conversation turn/photo quotas. Complete-request token/byte checks refuse overflow or missing token counting. A deterministic projection preserves all active typed attempts and facts.</w:t>
+      </w:r>
+    </w:p>
+    <w:p>
+      <w:pPr>
+        <w:pStyle w:val="ListBullet"/>
+      </w:pPr>
+      <w:r>
+        <w:t>A project-derived versioned system policy defines generator, verifier, interpreter and observation-only vision roles. A manifest binds policy bytes. Changed bytes or an unknown role fail closed. This policy is not installed in the shared serving runtime.</w:t>
+      </w:r>
+    </w:p>
+    <w:p>
+      <w:pPr>
+        <w:pStyle w:val="ListBullet"/>
+      </w:pPr>
+      <w:r>
+        <w:t>Validation passes 29 engineering tests and five desktop/mobile browser checks, including inline input, no category help, structured unresolved feedback and no overflow. These are synthetic software checks, not live source/model quality or hosted release acceptance.</w:t>
+      </w:r>
+    </w:p>
+    <w:p>
+      <w:pPr>
+        <w:pStyle w:val="Heading2"/>
+      </w:pPr>
+      <w:r>
+        <w:t>Initial application limits</w:t>
+      </w:r>
+    </w:p>
+    <w:p>
+      <w:pPr>
+        <w:pStyle w:val="ListBullet"/>
+      </w:pPr>
+      <w:r>
+        <w:t>Text: 2,000 Unicode characters and 8,000 UTF-8 bytes per message; JSON request body 16 KiB.</w:t>
+      </w:r>
+    </w:p>
+    <w:p>
+      <w:pPr>
+        <w:pStyle w:val="ListBullet"/>
+      </w:pPr>
+      <w:r>
+        <w:t>Photos: one per turn, 5 MiB each, JPEG/PNG/WebP only; three per conversation and six per visitor per rolling 24 hours. Single frame, at most 20 megapixels and 10,000 pixels per side; normalize to at most 1,600 pixels per side and strip metadata.</w:t>
+      </w:r>
+    </w:p>
+    <w:p>
+      <w:pPr>
+        <w:pStyle w:val="ListBullet"/>
+      </w:pPr>
+      <w:r>
+        <w:t>Turns: 20 accepted rider turns per conversation; six per visitor per rolling minute and 30 per rolling 24 hours. New conversations do not reset visitor counts. Failed admitted turns consume their reservation.</w:t>
+      </w:r>
+    </w:p>
+    <w:p>
+      <w:pPr>
+        <w:pStyle w:val="ListBullet"/>
+      </w:pPr>
+      <w:r>
+        <w:t>Model: 8,192 counted input tokens and 24,000 serialized request bytes including policy, schema, evidence and state; at most 1,800 output tokens. These are application bounds, not verified provider quotas.</w:t>
+      </w:r>
+    </w:p>
+    <w:p>
+      <w:pPr>
+        <w:pStyle w:val="ListBullet"/>
+      </w:pPr>
+      <w:r>
+        <w:t>Retention: 30-minute idle expiry and 24-hour session/operation lifetime; raw and normalized media deletion within 15 minutes. Actual managed TTL and deletion jobs remain required.</w:t>
+      </w:r>
+    </w:p>
+    <w:p>
+      <w:pPr>
+        <w:pStyle w:val="Heading2"/>
+      </w:pPr>
+      <w:r>
+        <w:t>Context management</w:t>
+      </w:r>
+    </w:p>
+    <w:p>
+      <w:r>
+        <w:t>There is no automatic LLM compaction in the current application. Composer requests contain current selected evidence and the last 12 active attempt identifiers/outcomes, rather than an accumulated chat transcript. The controller retains complete typed history. Twelve attempts is not a model-window limit. The new projection preserves every active outcome and confirmed fact; immutable superseded events remain in managed storage. Never summarize away required warnings, prerequisites, source citations or unresolved outcomes. A request that cannot fit its complete budget is withheld as an operational failure, rather than silently truncated. There is no fixed number of turns before a context window fills; the 20-turn cap is an abuse bound.</w:t>
+      </w:r>
+    </w:p>
+    <w:p>
+      <w:pPr>
+        <w:pStyle w:val="Heading2"/>
+      </w:pPr>
+      <w:r>
+        <w:t>Hosted release items still open</w:t>
+      </w:r>
+    </w:p>
+    <w:p>
+      <w:pPr>
+        <w:pStyle w:val="ListBullet"/>
+      </w:pPr>
+      <w:r>
+        <w:t>Install the hosted catalogue, session, feedback and recovery API with managed transactional session storage, ownership, CAS versions and idempotent responses.</w:t>
+      </w:r>
+    </w:p>
+    <w:p>
+      <w:pPr>
+        <w:pStyle w:val="ListBullet"/>
+      </w:pPr>
+      <w:r>
+        <w:t>Enforce trusted visitor/IP and project limits across workers, signed capabilities and challenges for reset abuse; reserve per-day spend and provider calls before inference. An admission-store outage blocks new inference.</w:t>
+      </w:r>
+    </w:p>
+    <w:p>
+      <w:pPr>
+        <w:pStyle w:val="ListBullet"/>
+      </w:pPr>
+      <w:r>
+        <w:t>Install the new system/role policy and context request in a reviewed runtime version, invalidate affected response caches, verify exact-model token counting and preserve the approved source package.</w:t>
+      </w:r>
+    </w:p>
+    <w:p>
+      <w:pPr>
+        <w:pStyle w:val="ListBullet"/>
+      </w:pPr>
+      <w:r>
+        <w:t>Enforce actual streamed body/upload limits, decode worker resources, idle/session TTL, media deletion and redacted correlated telemetry.</w:t>
+      </w:r>
+    </w:p>
+    <w:p>
+      <w:pPr>
+        <w:pStyle w:val="ListBullet"/>
+      </w:pPr>
+      <w:r>
+        <w:t>Pass Browser to hosted controller to real BGE and BM25 to dependency assembly to gated generation and verifier to complete cited response, with cache bypassed. Record actual warm/cold p95, errors and cost; three samples cannot establish p95.</w:t>
+      </w:r>
+    </w:p>
+    <w:p>
+      <w:pPr>
+        <w:pStyle w:val="ListBullet"/>
+      </w:pPr>
+      <w:r>
+        <w:t>Only after text acceptance, connect and evaluate observation-only photos through the same evidence gate. Complete held-out and adaptive evaluation, deployment and rollback/retention handover.</w:t>
+      </w:r>
+    </w:p>
+    <w:p>
+      <w:r>
+        <w:t>No generic human-only source blocker is reinstated for the exact approved v3 scopes. New prompt/runtime bindings still require exact-version review. No model substitution, provider calls, billing restart, index rebuild or deployment is implied by this reconciliation. See rider_ui/SERVICE_SAFEGUARDS.md, TODO.md and IMPLEMENTATION_PROGRESS.md for implementation and remaining evidence.</w:t>
+      </w:r>
+    </w:p>
     <w:sectPr>
       <w:headerReference w:type="default" r:id="rId9"/>
       <w:footerReference w:type="default" r:id="rId10"/>
+      <w:footerReference w:type="first" r:id="rId11"/>
+      <w:footerReference w:type="even" r:id="rId12"/>
+      <w:headerReference w:type="first" r:id="rId13"/>
+      <w:headerReference w:type="even" r:id="rId14"/>
       <w:pgSz w:w="12240" w:h="15840"/>
       <w:pgMar w:top="1123" w:right="1109" w:bottom="1008" w:left="1109" w:header="720" w:footer="720" w:gutter="0"/>
       <w:cols w:space="720"/>
@@ -6738,9 +7042,29 @@
         <w:color w:val="526071"/>
         <w:sz w:val="16"/>
       </w:rPr>
-      <w:t xml:space="preserve">DRAFT • OWNER-MANUAL PILOT     |     08 OCTOBER 2026     |     </w:t>
+      <w:t xml:space="preserve">DRAFT • OWNER-MANUAL PILOT     |     09 OCTOBER 2026     |     </w:t>
     </w:r>
     <w:fldSimple w:instr="PAGE"/>
+  </w:p>
+</w:ftr>
+</file>
+
+<file path=word/footer2.xml><?xml version="1.0" encoding="utf-8"?>
+<w:ftr xmlns:m="http://schemas.openxmlformats.org/officeDocument/2006/math" xmlns:mc="http://schemas.openxmlformats.org/markup-compatibility/2006" xmlns:mo="http://schemas.microsoft.com/office/mac/office/2008/main" xmlns:mv="urn:schemas-microsoft-com:mac:vml" xmlns:o="urn:schemas-microsoft-com:office:office" xmlns:r="http://schemas.openxmlformats.org/officeDocument/2006/relationships" xmlns:v="urn:schemas-microsoft-com:vml" xmlns:w10="urn:schemas-microsoft-com:office:word" xmlns:w14="http://schemas.microsoft.com/office/word/2010/wordml" xmlns:w="http://schemas.openxmlformats.org/wordprocessingml/2006/main" xmlns:wne="http://schemas.microsoft.com/office/word/2006/wordml" xmlns:wp14="http://schemas.microsoft.com/office/word/2010/wordprocessingDrawing" xmlns:wp="http://schemas.openxmlformats.org/drawingml/2006/wordprocessingDrawing" xmlns:wpc="http://schemas.microsoft.com/office/word/2010/wordprocessingCanvas" xmlns:wpg="http://schemas.microsoft.com/office/word/2010/wordprocessingGroup" xmlns:wpi="http://schemas.microsoft.com/office/word/2010/wordprocessingInk" xmlns:wps="http://schemas.microsoft.com/office/word/2010/wordprocessingShape" mc:Ignorable="w14 wp14">
+  <w:p>
+    <w:pPr>
+      <w:pStyle w:val="Footer"/>
+    </w:pPr>
+  </w:p>
+</w:ftr>
+</file>
+
+<file path=word/footer3.xml><?xml version="1.0" encoding="utf-8"?>
+<w:ftr xmlns:m="http://schemas.openxmlformats.org/officeDocument/2006/math" xmlns:mc="http://schemas.openxmlformats.org/markup-compatibility/2006" xmlns:mo="http://schemas.microsoft.com/office/mac/office/2008/main" xmlns:mv="urn:schemas-microsoft-com:mac:vml" xmlns:o="urn:schemas-microsoft-com:office:office" xmlns:r="http://schemas.openxmlformats.org/officeDocument/2006/relationships" xmlns:v="urn:schemas-microsoft-com:vml" xmlns:w10="urn:schemas-microsoft-com:office:word" xmlns:w14="http://schemas.microsoft.com/office/word/2010/wordml" xmlns:w="http://schemas.openxmlformats.org/wordprocessingml/2006/main" xmlns:wne="http://schemas.microsoft.com/office/word/2006/wordml" xmlns:wp14="http://schemas.microsoft.com/office/word/2010/wordprocessingDrawing" xmlns:wp="http://schemas.openxmlformats.org/drawingml/2006/wordprocessingDrawing" xmlns:wpc="http://schemas.microsoft.com/office/word/2010/wordprocessingCanvas" xmlns:wpg="http://schemas.microsoft.com/office/word/2010/wordprocessingGroup" xmlns:wpi="http://schemas.microsoft.com/office/word/2010/wordprocessingInk" xmlns:wps="http://schemas.microsoft.com/office/word/2010/wordprocessingShape" mc:Ignorable="w14 wp14">
+  <w:p>
+    <w:pPr>
+      <w:pStyle w:val="Footer"/>
+    </w:pPr>
   </w:p>
 </w:ftr>
 </file>
@@ -6754,11 +7078,31 @@
     </w:pPr>
     <w:r>
       <w:rPr>
-        <w:color w:val="007F7B"/>
+        <w:color w:val="000000"/>
         <w:sz w:val="16"/>
       </w:rPr>
       <w:t>MOTOMEDIC AI   |   DESIGN PACKAGE</w:t>
     </w:r>
+  </w:p>
+</w:hdr>
+</file>
+
+<file path=word/header2.xml><?xml version="1.0" encoding="utf-8"?>
+<w:hdr xmlns:m="http://schemas.openxmlformats.org/officeDocument/2006/math" xmlns:mc="http://schemas.openxmlformats.org/markup-compatibility/2006" xmlns:mo="http://schemas.microsoft.com/office/mac/office/2008/main" xmlns:mv="urn:schemas-microsoft-com:mac:vml" xmlns:o="urn:schemas-microsoft-com:office:office" xmlns:r="http://schemas.openxmlformats.org/officeDocument/2006/relationships" xmlns:v="urn:schemas-microsoft-com:vml" xmlns:w10="urn:schemas-microsoft-com:office:word" xmlns:w14="http://schemas.microsoft.com/office/word/2010/wordml" xmlns:w="http://schemas.openxmlformats.org/wordprocessingml/2006/main" xmlns:wne="http://schemas.microsoft.com/office/word/2006/wordml" xmlns:wp14="http://schemas.microsoft.com/office/word/2010/wordprocessingDrawing" xmlns:wp="http://schemas.openxmlformats.org/drawingml/2006/wordprocessingDrawing" xmlns:wpc="http://schemas.microsoft.com/office/word/2010/wordprocessingCanvas" xmlns:wpg="http://schemas.microsoft.com/office/word/2010/wordprocessingGroup" xmlns:wpi="http://schemas.microsoft.com/office/word/2010/wordprocessingInk" xmlns:wps="http://schemas.microsoft.com/office/word/2010/wordprocessingShape" mc:Ignorable="w14 wp14">
+  <w:p>
+    <w:pPr>
+      <w:pStyle w:val="Header"/>
+    </w:pPr>
+  </w:p>
+</w:hdr>
+</file>
+
+<file path=word/header3.xml><?xml version="1.0" encoding="utf-8"?>
+<w:hdr xmlns:m="http://schemas.openxmlformats.org/officeDocument/2006/math" xmlns:mc="http://schemas.openxmlformats.org/markup-compatibility/2006" xmlns:mo="http://schemas.microsoft.com/office/mac/office/2008/main" xmlns:mv="urn:schemas-microsoft-com:mac:vml" xmlns:o="urn:schemas-microsoft-com:office:office" xmlns:r="http://schemas.openxmlformats.org/officeDocument/2006/relationships" xmlns:v="urn:schemas-microsoft-com:vml" xmlns:w10="urn:schemas-microsoft-com:office:word" xmlns:w14="http://schemas.microsoft.com/office/word/2010/wordml" xmlns:w="http://schemas.openxmlformats.org/wordprocessingml/2006/main" xmlns:wne="http://schemas.microsoft.com/office/word/2006/wordml" xmlns:wp14="http://schemas.microsoft.com/office/word/2010/wordprocessingDrawing" xmlns:wp="http://schemas.openxmlformats.org/drawingml/2006/wordprocessingDrawing" xmlns:wpc="http://schemas.microsoft.com/office/word/2010/wordprocessingCanvas" xmlns:wpg="http://schemas.microsoft.com/office/word/2010/wordprocessingGroup" xmlns:wpi="http://schemas.microsoft.com/office/word/2010/wordprocessingInk" xmlns:wps="http://schemas.microsoft.com/office/word/2010/wordprocessingShape" mc:Ignorable="w14 wp14">
+  <w:p>
+    <w:pPr>
+      <w:pStyle w:val="Header"/>
+    </w:pPr>
   </w:p>
 </w:hdr>
 </file>
@@ -7197,7 +7541,7 @@
       <w:rFonts w:asciiTheme="majorHAnsi" w:eastAsiaTheme="majorEastAsia" w:hAnsiTheme="majorHAnsi" w:cstheme="majorBidi" w:ascii="Aptos Display" w:hAnsi="Aptos Display"/>
       <w:b/>
       <w:bCs/>
-      <w:color w:val="102238"/>
+      <w:color w:val="000000"/>
       <w:sz w:val="28"/>
       <w:szCs w:val="28"/>
     </w:rPr>
@@ -7221,7 +7565,7 @@
       <w:rFonts w:asciiTheme="majorHAnsi" w:eastAsiaTheme="majorEastAsia" w:hAnsiTheme="majorHAnsi" w:cstheme="majorBidi" w:ascii="Aptos" w:hAnsi="Aptos"/>
       <w:b/>
       <w:bCs/>
-      <w:color w:val="1766A5"/>
+      <w:color w:val="000000"/>
       <w:sz w:val="23"/>
       <w:szCs w:val="26"/>
     </w:rPr>
@@ -7245,7 +7589,7 @@
       <w:rFonts w:asciiTheme="majorHAnsi" w:eastAsiaTheme="majorEastAsia" w:hAnsiTheme="majorHAnsi" w:cstheme="majorBidi" w:ascii="Aptos" w:hAnsi="Aptos"/>
       <w:b/>
       <w:bCs/>
-      <w:color w:val="007F7B"/>
+      <w:color w:val="000000"/>
       <w:sz w:val="20"/>
     </w:rPr>
   </w:style>
@@ -7478,16 +7822,13 @@
     <w:rsid w:val="00FC693F"/>
     <w:pPr>
       <w:keepNext/>
-      <w:pBdr>
-        <w:bottom w:val="single" w:sz="8" w:space="4" w:color="4F81BD" w:themeColor="accent1"/>
-      </w:pBdr>
       <w:spacing w:after="160" w:line="240" w:lineRule="auto" w:before="0"/>
       <w:contextualSpacing/>
     </w:pPr>
     <w:rPr>
       <w:rFonts w:asciiTheme="majorHAnsi" w:eastAsiaTheme="majorEastAsia" w:hAnsiTheme="majorHAnsi" w:cstheme="majorBidi" w:ascii="Aptos Display" w:hAnsi="Aptos Display"/>
       <w:b/>
-      <w:color w:val="102238"/>
+      <w:color w:val="000000"/>
       <w:spacing w:val="5"/>
       <w:kern w:val="28"/>
       <w:sz w:val="44"/>
@@ -7529,7 +7870,7 @@
       <w:b w:val="0"/>
       <w:i/>
       <w:iCs/>
-      <w:color w:val="526071"/>
+      <w:color w:val="000000"/>
       <w:spacing w:val="15"/>
       <w:sz w:val="21"/>
       <w:szCs w:val="24"/>

</xml_diff>

<commit_message>
Remove category selection and require hosted symptom intent resolution
</commit_message>
<xml_diff>
--- a/04_To_Build_Evaluation_Decisions.docx
+++ b/04_To_Build_Evaluation_Decisions.docx
@@ -635,7 +635,7 @@
           </w:tcPr>
           <w:p>
             <w:r>
-              <w:t>29 UI/boundary tests pass; hosted enforcement open</w:t>
+              <w:t>31 UI/boundary tests pass; hosted enforcement open</w:t>
             </w:r>
           </w:p>
         </w:tc>
@@ -6849,7 +6849,7 @@
         <w:pStyle w:val="ListBullet"/>
       </w:pPr>
       <w:r>
-        <w:t>The text chat input is inside What are you noticing. Category help text is removed; the accessible topic dropdown remains. Saved owner HTML wording and field-level removals are preserved.</w:t>
+        <w:t>The text chat input is inside What are you noticing. The entire category dropdown is removed. The UI submits symptoms for hosted intent resolution; the service must clarify ambiguous intent and apply the normal evidence gates before answering. Saved owner HTML wording and field-level removals are preserved.</w:t>
       </w:r>
     </w:p>
     <w:p>
@@ -6889,7 +6889,7 @@
         <w:pStyle w:val="ListBullet"/>
       </w:pPr>
       <w:r>
-        <w:t>Validation passes 29 engineering tests and five desktop/mobile browser checks, including inline input, no category help, structured unresolved feedback and no overflow. These are synthetic software checks, not live source/model quality or hosted release acceptance.</w:t>
+        <w:t>Validation passes 31 engineering tests and five desktop/mobile browser checks, including inline input, no category selector, structured unresolved feedback and no overflow. These are synthetic software checks, not live source/model quality or hosted release acceptance.</w:t>
       </w:r>
     </w:p>
     <w:p>

</xml_diff>

<commit_message>
Prioritize text entry and reconcile historical TODO approval statuses
</commit_message>
<xml_diff>
--- a/04_To_Build_Evaluation_Decisions.docx
+++ b/04_To_Build_Evaluation_Decisions.docx
@@ -31,7 +31,7 @@
           <w:color w:val="B5631D"/>
           <w:sz w:val="17"/>
         </w:rPr>
-        <w:t>v0.3  Refreshed 9 October 2026  Aligned to TRD v0.4</w:t>
+        <w:t>v0.3  Reconciled 11 October 2026  Aligned to TRD v0.4</w:t>
       </w:r>
     </w:p>
     <w:p>
@@ -3938,7 +3938,7 @@
     </w:p>
     <w:p>
       <w:r>
-        <w:t>Do not invent OEM facts. The supplied owner's manual has been indexed provisionally, and 37 atomic dialogue and lookup cases are drafted with source pages. Independently review their spans, outcomes and variant fit before approval; expand toward 50–100 cases, adding photograph scenarios only where evidence supports them.</w:t>
+        <w:t>The supplied owner manual is the sole prototype source. Earlier drafts contained 37 atomic cases. The exact v3 package now has coordinator approval for all 161 initial and source-content scopes following independent original-source checks. This does not approve arbitrary adaptive transitions or general photo performance. Use the exact version-bound scopes, preserve unresolved limitations, and independently evaluate held-out cases before performance or public-release claims.</w:t>
       </w:r>
     </w:p>
     <w:tbl>
@@ -6473,10 +6473,7 @@
         <w:pStyle w:val="Heading1"/>
       </w:pPr>
       <w:r>
-        <w:rPr>
-          <w:color w:val="000000"/>
-        </w:rPr>
-        <w:t>Current hosted status and bounded policy</w:t>
+        <w:t>Historical hosted status and bounded policy from 9 October 2026</w:t>
       </w:r>
     </w:p>
     <w:p>
@@ -7042,7 +7039,7 @@
         <w:color w:val="526071"/>
         <w:sz w:val="16"/>
       </w:rPr>
-      <w:t xml:space="preserve">DRAFT • OWNER-MANUAL PILOT     |     09 OCTOBER 2026     |     </w:t>
+      <w:t xml:space="preserve">DRAFT • OWNER-MANUAL PILOT     |     11 OCTOBER 2026     |     </w:t>
     </w:r>
     <w:fldSimple w:instr="PAGE"/>
   </w:p>

</xml_diff>

<commit_message>
Wire rider question UI and validate approved policy caveats
</commit_message>
<xml_diff>
--- a/04_To_Build_Evaluation_Decisions.docx
+++ b/04_To_Build_Evaluation_Decisions.docx
@@ -31,7 +31,7 @@
           <w:color w:val="B5631D"/>
           <w:sz w:val="17"/>
         </w:rPr>
-        <w:t>v0.3  Refreshed 9 October 2026  Aligned to TRD v0.4</w:t>
+        <w:t>v0.3  Reconciled 11 October 2026  Aligned to TRD v0.4</w:t>
       </w:r>
     </w:p>
     <w:p>
@@ -150,10 +150,7 @@
           </w:tcPr>
           <w:p>
             <w:r>
-              <w:rPr>
-                <w:sz w:val="16"/>
-              </w:rPr>
-              <w:t>REFRESHED v0.3</w:t>
+              <w:t>REFRESHED v0.3; dated reconciliation added</w:t>
             </w:r>
           </w:p>
         </w:tc>
@@ -164,10 +161,7 @@
           </w:tcPr>
           <w:p>
             <w:r>
-              <w:rPr>
-                <w:sz w:val="16"/>
-              </w:rPr>
-              <w:t>Aligned to TRD v0.4; source and release approval pending</w:t>
+              <w:t>TRD v0.4 governs; exact 161 initial/source scopes approved; remaining release gates tracked</w:t>
             </w:r>
           </w:p>
         </w:tc>
@@ -356,10 +350,7 @@
           </w:tcPr>
           <w:p>
             <w:r>
-              <w:rPr>
-                <w:sz w:val="16"/>
-              </w:rPr>
-              <w:t>DRAFT: 37 atomic cases; human review pending</w:t>
+              <w:t>161 exact initial/source scopes approved</w:t>
             </w:r>
           </w:p>
         </w:tc>
@@ -369,14 +360,8 @@
             <w:vAlign w:val="center"/>
           </w:tcPr>
           <w:p>
-            <w:pPr>
-              <w:spacing w:after="20"/>
-            </w:pPr>
-            <w:r>
-              <w:rPr>
-                <w:sz w:val="16"/>
-              </w:rPr>
-              <w:t>Verified exact citations and expected outcomes</w:t>
+            <w:r>
+              <w:t>V3 coordinator approval is content/version bound; adaptive and held-out release evaluation remains open</w:t>
             </w:r>
           </w:p>
         </w:tc>
@@ -408,10 +393,7 @@
           </w:tcPr>
           <w:p>
             <w:r>
-              <w:rPr>
-                <w:sz w:val="16"/>
-              </w:rPr>
-              <w:t>SPECIFIED; integration pending</w:t>
+              <w:t>INTEGRATED bounded text gates; serving release pending</w:t>
             </w:r>
           </w:p>
         </w:tc>
@@ -423,10 +405,7 @@
           </w:tcPr>
           <w:p>
             <w:r>
-              <w:rPr>
-                <w:sz w:val="16"/>
-              </w:rPr>
-              <w:t>Original-page review and verified support route</w:t>
+              <w:t>Retain five routes, warning/dependency/claim gates, typed outcomes and verified OEM route</w:t>
             </w:r>
           </w:p>
         </w:tc>
@@ -655,14 +634,8 @@
             <w:vAlign w:val="center"/>
           </w:tcPr>
           <w:p>
-            <w:pPr>
-              <w:spacing w:after="20"/>
-            </w:pPr>
-            <w:r>
-              <w:rPr>
-                <w:sz w:val="16"/>
-              </w:rPr>
-              <w:t>TO BUILD</w:t>
+            <w:r>
+              <w:t>31 UI/boundary tests pass; hosted enforcement open</w:t>
             </w:r>
           </w:p>
         </w:tc>
@@ -672,14 +645,8 @@
             <w:vAlign w:val="center"/>
           </w:tcPr>
           <w:p>
-            <w:pPr>
-              <w:spacing w:after="20"/>
-            </w:pPr>
-            <w:r>
-              <w:rPr>
-                <w:sz w:val="16"/>
-              </w:rPr>
-              <w:t>Prompt injection, media handling, credentials</w:t>
+            <w:r>
+              <w:t>Text/photo/context/quota/prompt binding checks; test actual identity, concurrency and retention in hosted service</w:t>
             </w:r>
           </w:p>
         </w:tc>
@@ -711,10 +678,7 @@
           </w:tcPr>
           <w:p>
             <w:r>
-              <w:rPr>
-                <w:sz w:val="16"/>
-              </w:rPr>
-              <w:t>PRIVATE retrieval backend deployed</w:t>
+              <w:t>UI implemented; hosted rider API and deployment pending</w:t>
             </w:r>
           </w:p>
         </w:tc>
@@ -726,10 +690,7 @@
           </w:tcPr>
           <w:p>
             <w:r>
-              <w:rPr>
-                <w:sz w:val="16"/>
-              </w:rPr>
-              <w:t>11/11 recorded backend checks; UI and logged-out rider tests pending</w:t>
+              <w:t>Real browser-to-retrieval-to-gated-answer acceptance required; retrieval service alone is not rider API</w:t>
             </w:r>
           </w:p>
         </w:tc>
@@ -811,10 +772,7 @@
           </w:tcPr>
           <w:p>
             <w:r>
-              <w:rPr>
-                <w:sz w:val="16"/>
-              </w:rPr>
-              <w:t>DRAFT: verify variant and rights</w:t>
+              <w:t>Exact approved Himalayan BS6 scope; citation metadata only</w:t>
             </w:r>
           </w:p>
         </w:tc>
@@ -825,14 +783,8 @@
             <w:shd w:fill="F3F6FA"/>
           </w:tcPr>
           <w:p>
-            <w:pPr>
-              <w:spacing w:after="20"/>
-            </w:pPr>
-            <w:r>
-              <w:rPr>
-                <w:sz w:val="16"/>
-              </w:rPr>
-              <w:t>Checksum, edition, citation provenance, rights</w:t>
+            <w:r>
+              <w:t>No rider PDF/excerpt/crop delivery; preserve exact source release scopes</w:t>
             </w:r>
           </w:p>
         </w:tc>
@@ -857,10 +809,7 @@
           </w:tcPr>
           <w:p>
             <w:r>
-              <w:rPr>
-                <w:sz w:val="16"/>
-              </w:rPr>
-              <w:t>PARTIAL prototypes and retrieval policy</w:t>
+              <w:t>Runtime gates plus tested safeguard components; hosted integration open</w:t>
             </w:r>
           </w:p>
         </w:tc>
@@ -870,10 +819,7 @@
           </w:tcPr>
           <w:p>
             <w:r>
-              <w:rPr>
-                <w:sz w:val="16"/>
-              </w:rPr>
-              <w:t>Integrated controller/evidence/cache/UI guards and reviewed regressions pending</w:t>
+              <w:t>Install managed admission, new prompt/context version, retention and actual browser regressions</w:t>
             </w:r>
           </w:p>
         </w:tc>
@@ -3899,10 +3845,7 @@
           </w:tcPr>
           <w:p>
             <w:r>
-              <w:rPr>
-                <w:sz w:val="16"/>
-              </w:rPr>
-              <w:t>Private GitHub hosted build; authenticated GCP Cloud Run Qdrant and private Storage; Streamlit UI pending</w:t>
+              <w:t>Private GitHub build; authenticated Qdrant and private Storage; Streamlit UI implemented, hosted rider-session API and live deployment pending</w:t>
             </w:r>
           </w:p>
         </w:tc>
@@ -3995,7 +3938,7 @@
     </w:p>
     <w:p>
       <w:r>
-        <w:t>Do not invent OEM facts. The supplied owner's manual has been indexed provisionally, and 37 atomic dialogue and lookup cases are drafted with source pages. Independently review their spans, outcomes and variant fit before approval; expand toward 50–100 cases, adding photograph scenarios only where evidence supports them.</w:t>
+        <w:t>The supplied owner manual is the sole prototype source. Earlier drafts contained 37 atomic cases. The exact v3 package now has coordinator approval for all 161 initial and source-content scopes following independent original-source checks. This does not approve arbitrary adaptive transitions or general photo performance. Use the exact version-bound scopes, preserve unresolved limitations, and independently evaluate held-out cases before performance or public-release claims.</w:t>
       </w:r>
     </w:p>
     <w:tbl>
@@ -6078,10 +6021,7 @@
           </w:tcPr>
           <w:p>
             <w:r>
-              <w:rPr>
-                <w:sz w:val="16"/>
-              </w:rPr>
-              <w:t>Observation-only photo path, Streamlit UI, secrets and upload/rate/day-spend limits; optional voice P1</w:t>
+              <w:t>Text UI and safeguard components tested; install managed sessions, identity/rate/spend/retention controls; photos remain disabled until live text gate passes</w:t>
             </w:r>
           </w:p>
         </w:tc>
@@ -6533,10 +6473,7 @@
         <w:pStyle w:val="Heading1"/>
       </w:pPr>
       <w:r>
-        <w:rPr>
-          <w:color w:val="000000"/>
-        </w:rPr>
-        <w:t>Current hosted status and bounded policy</w:t>
+        <w:t>Historical hosted status and bounded policy from 9 October 2026</w:t>
       </w:r>
     </w:p>
     <w:p>
@@ -6878,6 +6815,202 @@
         <w:t>Now: Hosted candidate build and recorded 11/11 backend checks complete; source approvals, UI, integrated controller/generator, holdout and public release remain open.</w:t>
       </w:r>
     </w:p>
+    <w:p>
+      <w:r>
+        <w:br w:type="page"/>
+      </w:r>
+    </w:p>
+    <w:p>
+      <w:pPr>
+        <w:pStyle w:val="Heading1"/>
+      </w:pPr>
+      <w:r>
+        <w:t>Rider UI and safeguards reconciliation 11 October 2026</w:t>
+      </w:r>
+    </w:p>
+    <w:p>
+      <w:r>
+        <w:t>This dated update reconciles the owner's UI, context, input-limit, system-prompt and guardrail requests with current implementation evidence. It supersedes historical progress statuses, without changing TRD v0.4 evidence contracts or the exact 161 approved initial and source scopes. The current working checklist is TODO.md.</w:t>
+      </w:r>
+    </w:p>
+    <w:p>
+      <w:pPr>
+        <w:pStyle w:val="Heading2"/>
+      </w:pPr>
+      <w:r>
+        <w:t>Completed components</w:t>
+      </w:r>
+    </w:p>
+    <w:p>
+      <w:pPr>
+        <w:pStyle w:val="ListBullet"/>
+      </w:pPr>
+      <w:r>
+        <w:t>The text chat input is inside What are you noticing. The entire category dropdown is removed. The UI submits symptoms for hosted intent resolution; the service must clarify ambiguous intent and apply the normal evidence gates before answering. Saved owner HTML wording and field-level removals are preserved.</w:t>
+      </w:r>
+    </w:p>
+    <w:p>
+      <w:pPr>
+        <w:pStyle w:val="ListBullet"/>
+      </w:pPr>
+      <w:r>
+        <w:t>Start a new conversation clears displayed messages and detaches the active diagnostic session, pending and error state. Bike/manual confirmation may remain. It does not delete stored records or reset visitor limits; reset is disabled while an operation is unresolved.</w:t>
+      </w:r>
+    </w:p>
+    <w:p>
+      <w:pPr>
+        <w:pStyle w:val="ListBullet"/>
+      </w:pPr>
+      <w:r>
+        <w:t>The UI and client enforce 2,000-character messages. Reusable hosted validators check text encoding, JSON byte limits, photo MIME and decoding, animation, image dimensions, pixels and compressed bytes. Photo support remains disabled.</w:t>
+      </w:r>
+    </w:p>
+    <w:p>
+      <w:pPr>
+        <w:pStyle w:val="ListBullet"/>
+      </w:pPr>
+      <w:r>
+        <w:t>Atomic admission checks cover visitor and conversation turn/photo quotas. Complete-request token/byte checks refuse overflow or missing token counting. A deterministic projection preserves all active typed attempts and facts.</w:t>
+      </w:r>
+    </w:p>
+    <w:p>
+      <w:pPr>
+        <w:pStyle w:val="ListBullet"/>
+      </w:pPr>
+      <w:r>
+        <w:t>A project-derived versioned system policy defines generator, verifier, interpreter and observation-only vision roles. A manifest binds policy bytes. Changed bytes or an unknown role fail closed. This policy is not installed in the shared serving runtime.</w:t>
+      </w:r>
+    </w:p>
+    <w:p>
+      <w:pPr>
+        <w:pStyle w:val="ListBullet"/>
+      </w:pPr>
+      <w:r>
+        <w:t>Validation passes 31 engineering tests and five desktop/mobile browser checks, including inline input, no category selector, structured unresolved feedback and no overflow. These are synthetic software checks, not live source/model quality or hosted release acceptance.</w:t>
+      </w:r>
+    </w:p>
+    <w:p>
+      <w:pPr>
+        <w:pStyle w:val="Heading2"/>
+      </w:pPr>
+      <w:r>
+        <w:t>Initial application limits</w:t>
+      </w:r>
+    </w:p>
+    <w:p>
+      <w:pPr>
+        <w:pStyle w:val="ListBullet"/>
+      </w:pPr>
+      <w:r>
+        <w:t>Text: 2,000 Unicode characters and 8,000 UTF-8 bytes per message; JSON request body 16 KiB.</w:t>
+      </w:r>
+    </w:p>
+    <w:p>
+      <w:pPr>
+        <w:pStyle w:val="ListBullet"/>
+      </w:pPr>
+      <w:r>
+        <w:t>Photos: one per turn, 5 MiB each, JPEG/PNG/WebP only; three per conversation and six per visitor per rolling 24 hours. Single frame, at most 20 megapixels and 10,000 pixels per side; normalize to at most 1,600 pixels per side and strip metadata.</w:t>
+      </w:r>
+    </w:p>
+    <w:p>
+      <w:pPr>
+        <w:pStyle w:val="ListBullet"/>
+      </w:pPr>
+      <w:r>
+        <w:t>Turns: 20 accepted rider turns per conversation; six per visitor per rolling minute and 30 per rolling 24 hours. New conversations do not reset visitor counts. Failed admitted turns consume their reservation.</w:t>
+      </w:r>
+    </w:p>
+    <w:p>
+      <w:pPr>
+        <w:pStyle w:val="ListBullet"/>
+      </w:pPr>
+      <w:r>
+        <w:t>Model: 8,192 counted input tokens and 24,000 serialized request bytes including policy, schema, evidence and state; at most 1,800 output tokens. These are application bounds, not verified provider quotas.</w:t>
+      </w:r>
+    </w:p>
+    <w:p>
+      <w:pPr>
+        <w:pStyle w:val="ListBullet"/>
+      </w:pPr>
+      <w:r>
+        <w:t>Retention: 30-minute idle expiry and 24-hour session/operation lifetime; raw and normalized media deletion within 15 minutes. Actual managed TTL and deletion jobs remain required.</w:t>
+      </w:r>
+    </w:p>
+    <w:p>
+      <w:pPr>
+        <w:pStyle w:val="Heading2"/>
+      </w:pPr>
+      <w:r>
+        <w:t>Context management</w:t>
+      </w:r>
+    </w:p>
+    <w:p>
+      <w:r>
+        <w:t>There is no automatic LLM compaction in the current application. Composer requests contain current selected evidence and the last 12 active attempt identifiers/outcomes, rather than an accumulated chat transcript. The controller retains complete typed history. Twelve attempts is not a model-window limit. The new projection preserves every active outcome and confirmed fact; immutable superseded events remain in managed storage. Never summarize away required warnings, prerequisites, source citations or unresolved outcomes. A request that cannot fit its complete budget is withheld as an operational failure, rather than silently truncated. There is no fixed number of turns before a context window fills; the 20-turn cap is an abuse bound.</w:t>
+      </w:r>
+    </w:p>
+    <w:p>
+      <w:pPr>
+        <w:pStyle w:val="Heading2"/>
+      </w:pPr>
+      <w:r>
+        <w:t>Hosted release items still open</w:t>
+      </w:r>
+    </w:p>
+    <w:p>
+      <w:pPr>
+        <w:pStyle w:val="ListBullet"/>
+      </w:pPr>
+      <w:r>
+        <w:t>Install the hosted catalogue, session, feedback and recovery API with managed transactional session storage, ownership, CAS versions and idempotent responses.</w:t>
+      </w:r>
+    </w:p>
+    <w:p>
+      <w:pPr>
+        <w:pStyle w:val="ListBullet"/>
+      </w:pPr>
+      <w:r>
+        <w:t>Enforce trusted visitor/IP and project limits across workers, signed capabilities and challenges for reset abuse; reserve per-day spend and provider calls before inference. An admission-store outage blocks new inference.</w:t>
+      </w:r>
+    </w:p>
+    <w:p>
+      <w:pPr>
+        <w:pStyle w:val="ListBullet"/>
+      </w:pPr>
+      <w:r>
+        <w:t>Install the new system/role policy and context request in a reviewed runtime version, invalidate affected response caches, verify exact-model token counting and preserve the approved source package.</w:t>
+      </w:r>
+    </w:p>
+    <w:p>
+      <w:pPr>
+        <w:pStyle w:val="ListBullet"/>
+      </w:pPr>
+      <w:r>
+        <w:t>Enforce actual streamed body/upload limits, decode worker resources, idle/session TTL, media deletion and redacted correlated telemetry.</w:t>
+      </w:r>
+    </w:p>
+    <w:p>
+      <w:pPr>
+        <w:pStyle w:val="ListBullet"/>
+      </w:pPr>
+      <w:r>
+        <w:t>Pass Browser to hosted controller to real BGE and BM25 to dependency assembly to gated generation and verifier to complete cited response, with cache bypassed. Record actual warm/cold p95, errors and cost; three samples cannot establish p95.</w:t>
+      </w:r>
+    </w:p>
+    <w:p>
+      <w:pPr>
+        <w:pStyle w:val="ListBullet"/>
+      </w:pPr>
+      <w:r>
+        <w:t>Only after text acceptance, connect and evaluate observation-only photos through the same evidence gate. Complete held-out and adaptive evaluation, deployment and rollback/retention handover.</w:t>
+      </w:r>
+    </w:p>
+    <w:p>
+      <w:r>
+        <w:t>No generic human-only source blocker is reinstated for the exact approved v3 scopes. New prompt/runtime bindings still require exact-version review. No model substitution, provider calls, billing restart, index rebuild or deployment is implied by this reconciliation. See rider_ui/SERVICE_SAFEGUARDS.md, TODO.md and IMPLEMENTATION_PROGRESS.md for implementation and remaining evidence.</w:t>
+      </w:r>
+    </w:p>
     <w:sectPr>
       <w:headerReference w:type="default" r:id="rId9"/>
       <w:footerReference w:type="default" r:id="rId10"/>
@@ -6906,7 +7039,7 @@
         <w:color w:val="526071"/>
         <w:sz w:val="16"/>
       </w:rPr>
-      <w:t xml:space="preserve">DRAFT • OWNER-MANUAL PILOT     |     09 OCTOBER 2026     |     </w:t>
+      <w:t xml:space="preserve">DRAFT • OWNER-MANUAL PILOT     |     11 OCTOBER 2026     |     </w:t>
     </w:r>
     <w:fldSimple w:instr="PAGE"/>
   </w:p>

</xml_diff>